<commit_message>
fix(docs): kembalikan format/gaya asli Panduan-Pengguna.docx
Commit sebelumnya (d12b866) generate ulang docx pakai pandoc TANPA
reference-doc - hasilnya pakai template Word default pandoc, menghapus
seluruh format/gaya yang sudah disusun manual di file aslinya (font,
heading style, dst). Kesalahan murni, seharusnya dari awal pakai
--reference-doc.

Fix: ambil versi asli dari commit c753aa7 (sebelum pernah disentuh),
pakai sebagai --reference-doc pandoc - konten ter-update sesuai
dokumentasi_lengkap.md terbaru, TAPI gaya/format visual (font, heading,
style) ikut file asli, bukan default pandoc.
</commit_message>
<xml_diff>
--- a/docs-v2/documentation/Panduan-Pengguna-Executive-Dashboard.docx
+++ b/docs-v2/documentation/Panduan-Pengguna-Executive-Dashboard.docx
@@ -324,7 +324,7 @@
       <w:r>
         <w:drawing>
           <wp:inline>
-            <wp:extent cx="5334000" cy="3333750"/>
+            <wp:extent cx="5943600" cy="3714750"/>
             <wp:effectExtent b="0" l="0" r="0" t="0"/>
             <wp:docPr descr="Halaman Login" title="" id="1" name="Picture"/>
             <a:graphic>
@@ -345,7 +345,7 @@
                   <pic:spPr bwMode="auto">
                     <a:xfrm>
                       <a:off x="0" y="0"/>
-                      <a:ext cx="5334000" cy="3333750"/>
+                      <a:ext cx="5943600" cy="3714750"/>
                     </a:xfrm>
                     <a:prstGeom prst="rect">
                       <a:avLst/>
@@ -1858,7 +1858,7 @@
       <w:r>
         <w:drawing>
           <wp:inline>
-            <wp:extent cx="5334000" cy="3333750"/>
+            <wp:extent cx="5943600" cy="3714750"/>
             <wp:effectExtent b="0" l="0" r="0" t="0"/>
             <wp:docPr descr="Halaman RBAC" title="" id="1" name="Picture"/>
             <a:graphic>
@@ -1879,7 +1879,7 @@
                   <pic:spPr bwMode="auto">
                     <a:xfrm>
                       <a:off x="0" y="0"/>
-                      <a:ext cx="5334000" cy="3333750"/>
+                      <a:ext cx="5943600" cy="3714750"/>
                     </a:xfrm>
                     <a:prstGeom prst="rect">
                       <a:avLst/>
@@ -2004,7 +2004,7 @@
       <w:r>
         <w:drawing>
           <wp:inline>
-            <wp:extent cx="5334000" cy="3333750"/>
+            <wp:extent cx="5943600" cy="3714750"/>
             <wp:effectExtent b="0" l="0" r="0" t="0"/>
             <wp:docPr descr="Dialog Set Permission" title="" id="1" name="Picture"/>
             <a:graphic>
@@ -2025,7 +2025,7 @@
                   <pic:spPr bwMode="auto">
                     <a:xfrm>
                       <a:off x="0" y="0"/>
-                      <a:ext cx="5334000" cy="3333750"/>
+                      <a:ext cx="5943600" cy="3714750"/>
                     </a:xfrm>
                     <a:prstGeom prst="rect">
                       <a:avLst/>
@@ -3255,7 +3255,7 @@
       <w:r>
         <w:drawing>
           <wp:inline>
-            <wp:extent cx="5334000" cy="3333750"/>
+            <wp:extent cx="5943600" cy="3714750"/>
             <wp:effectExtent b="0" l="0" r="0" t="0"/>
             <wp:docPr descr="Halaman User Management" title="" id="1" name="Picture"/>
             <a:graphic>
@@ -3276,7 +3276,7 @@
                   <pic:spPr bwMode="auto">
                     <a:xfrm>
                       <a:off x="0" y="0"/>
-                      <a:ext cx="5334000" cy="3333750"/>
+                      <a:ext cx="5943600" cy="3714750"/>
                     </a:xfrm>
                     <a:prstGeom prst="rect">
                       <a:avLst/>
@@ -3524,7 +3524,7 @@
       <w:r>
         <w:drawing>
           <wp:inline>
-            <wp:extent cx="5334000" cy="3333750"/>
+            <wp:extent cx="5943600" cy="3714750"/>
             <wp:effectExtent b="0" l="0" r="0" t="0"/>
             <wp:docPr descr="Halaman App Settings" title="" id="1" name="Picture"/>
             <a:graphic>
@@ -3545,7 +3545,7 @@
                   <pic:spPr bwMode="auto">
                     <a:xfrm>
                       <a:off x="0" y="0"/>
-                      <a:ext cx="5334000" cy="3333750"/>
+                      <a:ext cx="5943600" cy="3714750"/>
                     </a:xfrm>
                     <a:prstGeom prst="rect">
                       <a:avLst/>
@@ -3743,7 +3743,7 @@
       <w:r>
         <w:drawing>
           <wp:inline>
-            <wp:extent cx="5334000" cy="3333750"/>
+            <wp:extent cx="5943600" cy="3714750"/>
             <wp:effectExtent b="0" l="0" r="0" t="0"/>
             <wp:docPr descr="Halaman Dashboard" title="" id="1" name="Picture"/>
             <a:graphic>
@@ -3764,7 +3764,7 @@
                   <pic:spPr bwMode="auto">
                     <a:xfrm>
                       <a:off x="0" y="0"/>
-                      <a:ext cx="5334000" cy="3333750"/>
+                      <a:ext cx="5943600" cy="3714750"/>
                     </a:xfrm>
                     <a:prstGeom prst="rect">
                       <a:avLst/>
@@ -4335,7 +4335,7 @@
       <w:r>
         <w:drawing>
           <wp:inline>
-            <wp:extent cx="5334000" cy="3333750"/>
+            <wp:extent cx="5943600" cy="3714750"/>
             <wp:effectExtent b="0" l="0" r="0" t="0"/>
             <wp:docPr descr="Halaman Customer List" title="" id="1" name="Picture"/>
             <a:graphic>
@@ -4356,7 +4356,7 @@
                   <pic:spPr bwMode="auto">
                     <a:xfrm>
                       <a:off x="0" y="0"/>
-                      <a:ext cx="5334000" cy="3333750"/>
+                      <a:ext cx="5943600" cy="3714750"/>
                     </a:xfrm>
                     <a:prstGeom prst="rect">
                       <a:avLst/>
@@ -4406,7 +4406,7 @@
       <w:r>
         <w:drawing>
           <wp:inline>
-            <wp:extent cx="5334000" cy="3333750"/>
+            <wp:extent cx="5943600" cy="3714750"/>
             <wp:effectExtent b="0" l="0" r="0" t="0"/>
             <wp:docPr descr="Dialog Detail Pelanggan" title="" id="1" name="Picture"/>
             <a:graphic>
@@ -4427,7 +4427,7 @@
                   <pic:spPr bwMode="auto">
                     <a:xfrm>
                       <a:off x="0" y="0"/>
-                      <a:ext cx="5334000" cy="3333750"/>
+                      <a:ext cx="5943600" cy="3714750"/>
                     </a:xfrm>
                     <a:prstGeom prst="rect">
                       <a:avLst/>
@@ -4487,7 +4487,7 @@
       <w:r>
         <w:drawing>
           <wp:inline>
-            <wp:extent cx="5334000" cy="3333750"/>
+            <wp:extent cx="5943600" cy="3714750"/>
             <wp:effectExtent b="0" l="0" r="0" t="0"/>
             <wp:docPr descr="Halaman Expansion Targets" title="" id="1" name="Picture"/>
             <a:graphic>
@@ -4508,7 +4508,7 @@
                   <pic:spPr bwMode="auto">
                     <a:xfrm>
                       <a:off x="0" y="0"/>
-                      <a:ext cx="5334000" cy="3333750"/>
+                      <a:ext cx="5943600" cy="3714750"/>
                     </a:xfrm>
                     <a:prstGeom prst="rect">
                       <a:avLst/>
@@ -4647,7 +4647,7 @@
       <w:r>
         <w:drawing>
           <wp:inline>
-            <wp:extent cx="5334000" cy="3333750"/>
+            <wp:extent cx="5943600" cy="3714750"/>
             <wp:effectExtent b="0" l="0" r="0" t="0"/>
             <wp:docPr descr="Modal GP Breakdown" title="" id="1" name="Picture"/>
             <a:graphic>
@@ -4668,7 +4668,7 @@
                   <pic:spPr bwMode="auto">
                     <a:xfrm>
                       <a:off x="0" y="0"/>
-                      <a:ext cx="5334000" cy="3333750"/>
+                      <a:ext cx="5943600" cy="3714750"/>
                     </a:xfrm>
                     <a:prstGeom prst="rect">
                       <a:avLst/>
@@ -4788,7 +4788,7 @@
       <w:r>
         <w:drawing>
           <wp:inline>
-            <wp:extent cx="5334000" cy="3333750"/>
+            <wp:extent cx="5943600" cy="3714750"/>
             <wp:effectExtent b="0" l="0" r="0" t="0"/>
             <wp:docPr descr="Modal ROR Breakdown" title="" id="1" name="Picture"/>
             <a:graphic>
@@ -4809,7 +4809,7 @@
                   <pic:spPr bwMode="auto">
                     <a:xfrm>
                       <a:off x="0" y="0"/>
-                      <a:ext cx="5334000" cy="3333750"/>
+                      <a:ext cx="5943600" cy="3714750"/>
                     </a:xfrm>
                     <a:prstGeom prst="rect">
                       <a:avLst/>
@@ -4935,7 +4935,7 @@
       <w:r>
         <w:drawing>
           <wp:inline>
-            <wp:extent cx="5334000" cy="3333750"/>
+            <wp:extent cx="5943600" cy="3714750"/>
             <wp:effectExtent b="0" l="0" r="0" t="0"/>
             <wp:docPr descr="Halaman Churn Risk" title="" id="1" name="Picture"/>
             <a:graphic>
@@ -4956,7 +4956,7 @@
                   <pic:spPr bwMode="auto">
                     <a:xfrm>
                       <a:off x="0" y="0"/>
-                      <a:ext cx="5334000" cy="3333750"/>
+                      <a:ext cx="5943600" cy="3714750"/>
                     </a:xfrm>
                     <a:prstGeom prst="rect">
                       <a:avLst/>
@@ -5098,7 +5098,7 @@
       <w:r>
         <w:drawing>
           <wp:inline>
-            <wp:extent cx="5334000" cy="3333750"/>
+            <wp:extent cx="5943600" cy="3714750"/>
             <wp:effectExtent b="0" l="0" r="0" t="0"/>
             <wp:docPr descr="Halaman Cross Sell Matrix" title="" id="1" name="Picture"/>
             <a:graphic>
@@ -5119,7 +5119,7 @@
                   <pic:spPr bwMode="auto">
                     <a:xfrm>
                       <a:off x="0" y="0"/>
-                      <a:ext cx="5334000" cy="3333750"/>
+                      <a:ext cx="5943600" cy="3714750"/>
                     </a:xfrm>
                     <a:prstGeom prst="rect">
                       <a:avLst/>
@@ -5232,7 +5232,7 @@
       <w:r>
         <w:drawing>
           <wp:inline>
-            <wp:extent cx="5334000" cy="3333750"/>
+            <wp:extent cx="5943600" cy="3714750"/>
             <wp:effectExtent b="0" l="0" r="0" t="0"/>
             <wp:docPr descr="Halaman Product Ledger" title="" id="1" name="Picture"/>
             <a:graphic>
@@ -5253,7 +5253,7 @@
                   <pic:spPr bwMode="auto">
                     <a:xfrm>
                       <a:off x="0" y="0"/>
-                      <a:ext cx="5334000" cy="3333750"/>
+                      <a:ext cx="5943600" cy="3714750"/>
                     </a:xfrm>
                     <a:prstGeom prst="rect">
                       <a:avLst/>
@@ -5303,7 +5303,7 @@
       <w:r>
         <w:drawing>
           <wp:inline>
-            <wp:extent cx="5334000" cy="3333750"/>
+            <wp:extent cx="5943600" cy="3714750"/>
             <wp:effectExtent b="0" l="0" r="0" t="0"/>
             <wp:docPr descr="Dialog Category Products" title="" id="1" name="Picture"/>
             <a:graphic>
@@ -5324,7 +5324,7 @@
                   <pic:spPr bwMode="auto">
                     <a:xfrm>
                       <a:off x="0" y="0"/>
-                      <a:ext cx="5334000" cy="3333750"/>
+                      <a:ext cx="5943600" cy="3714750"/>
                     </a:xfrm>
                     <a:prstGeom prst="rect">
                       <a:avLst/>
@@ -5376,7 +5376,7 @@
       <w:r>
         <w:drawing>
           <wp:inline>
-            <wp:extent cx="5334000" cy="3333750"/>
+            <wp:extent cx="5943600" cy="3714750"/>
             <wp:effectExtent b="0" l="0" r="0" t="0"/>
             <wp:docPr descr="Halaman High Margin Push" title="" id="1" name="Picture"/>
             <a:graphic>
@@ -5397,7 +5397,7 @@
                   <pic:spPr bwMode="auto">
                     <a:xfrm>
                       <a:off x="0" y="0"/>
-                      <a:ext cx="5334000" cy="3333750"/>
+                      <a:ext cx="5943600" cy="3714750"/>
                     </a:xfrm>
                     <a:prstGeom prst="rect">
                       <a:avLst/>
@@ -5466,7 +5466,7 @@
       <w:r>
         <w:drawing>
           <wp:inline>
-            <wp:extent cx="5334000" cy="3333750"/>
+            <wp:extent cx="5943600" cy="3714750"/>
             <wp:effectExtent b="0" l="0" r="0" t="0"/>
             <wp:docPr descr="Tab Upsell Targets" title="" id="1" name="Picture"/>
             <a:graphic>
@@ -5487,7 +5487,7 @@
                   <pic:spPr bwMode="auto">
                     <a:xfrm>
                       <a:off x="0" y="0"/>
-                      <a:ext cx="5334000" cy="3333750"/>
+                      <a:ext cx="5943600" cy="3714750"/>
                     </a:xfrm>
                     <a:prstGeom prst="rect">
                       <a:avLst/>
@@ -5557,7 +5557,7 @@
       <w:r>
         <w:drawing>
           <wp:inline>
-            <wp:extent cx="5334000" cy="3333750"/>
+            <wp:extent cx="5943600" cy="3714750"/>
             <wp:effectExtent b="0" l="0" r="0" t="0"/>
             <wp:docPr descr="Halaman Product Trend" title="" id="1" name="Picture"/>
             <a:graphic>
@@ -5578,7 +5578,7 @@
                   <pic:spPr bwMode="auto">
                     <a:xfrm>
                       <a:off x="0" y="0"/>
-                      <a:ext cx="5334000" cy="3333750"/>
+                      <a:ext cx="5943600" cy="3714750"/>
                     </a:xfrm>
                     <a:prstGeom prst="rect">
                       <a:avLst/>
@@ -5647,7 +5647,7 @@
       <w:r>
         <w:drawing>
           <wp:inline>
-            <wp:extent cx="5334000" cy="3333750"/>
+            <wp:extent cx="5943600" cy="3714750"/>
             <wp:effectExtent b="0" l="0" r="0" t="0"/>
             <wp:docPr descr="Halaman Transaction Ledger" title="" id="1" name="Picture"/>
             <a:graphic>
@@ -5668,7 +5668,7 @@
                   <pic:spPr bwMode="auto">
                     <a:xfrm>
                       <a:off x="0" y="0"/>
-                      <a:ext cx="5334000" cy="3333750"/>
+                      <a:ext cx="5943600" cy="3714750"/>
                     </a:xfrm>
                     <a:prstGeom prst="rect">
                       <a:avLst/>
@@ -5762,7 +5762,7 @@
       <w:r>
         <w:drawing>
           <wp:inline>
-            <wp:extent cx="5334000" cy="3333750"/>
+            <wp:extent cx="5943600" cy="3714750"/>
             <wp:effectExtent b="0" l="0" r="0" t="0"/>
             <wp:docPr descr="Halaman Import" title="" id="1" name="Picture"/>
             <a:graphic>
@@ -5783,7 +5783,7 @@
                   <pic:spPr bwMode="auto">
                     <a:xfrm>
                       <a:off x="0" y="0"/>
-                      <a:ext cx="5334000" cy="3333750"/>
+                      <a:ext cx="5943600" cy="3714750"/>
                     </a:xfrm>
                     <a:prstGeom prst="rect">
                       <a:avLst/>
@@ -7237,7 +7237,7 @@
       <w:r>
         <w:drawing>
           <wp:inline>
-            <wp:extent cx="5334000" cy="3333750"/>
+            <wp:extent cx="5943600" cy="3714750"/>
             <wp:effectExtent b="0" l="0" r="0" t="0"/>
             <wp:docPr descr="Halaman Audit Log" title="" id="1" name="Picture"/>
             <a:graphic>
@@ -7258,7 +7258,7 @@
                   <pic:spPr bwMode="auto">
                     <a:xfrm>
                       <a:off x="0" y="0"/>
-                      <a:ext cx="5334000" cy="3333750"/>
+                      <a:ext cx="5943600" cy="3714750"/>
                     </a:xfrm>
                     <a:prstGeom prst="rect">
                       <a:avLst/>
@@ -7404,7 +7404,7 @@
       <w:r>
         <w:drawing>
           <wp:inline>
-            <wp:extent cx="5334000" cy="1136196"/>
+            <wp:extent cx="5943600" cy="1266047"/>
             <wp:effectExtent b="0" l="0" r="0" t="0"/>
             <wp:docPr descr="Diagram 1" title="" id="1" name="Picture"/>
             <a:graphic>
@@ -7425,7 +7425,7 @@
                   <pic:spPr bwMode="auto">
                     <a:xfrm>
                       <a:off x="0" y="0"/>
-                      <a:ext cx="5334000" cy="1136196"/>
+                      <a:ext cx="5943600" cy="1266047"/>
                     </a:xfrm>
                     <a:prstGeom prst="rect">
                       <a:avLst/>
@@ -7469,7 +7469,7 @@
       <w:r>
         <w:drawing>
           <wp:inline>
-            <wp:extent cx="5334000" cy="13226142"/>
+            <wp:extent cx="5943600" cy="14737702"/>
             <wp:effectExtent b="0" l="0" r="0" t="0"/>
             <wp:docPr descr="Diagram 2" title="" id="1" name="Picture"/>
             <a:graphic>
@@ -7490,7 +7490,7 @@
                   <pic:spPr bwMode="auto">
                     <a:xfrm>
                       <a:off x="0" y="0"/>
-                      <a:ext cx="5334000" cy="13226142"/>
+                      <a:ext cx="5943600" cy="14737702"/>
                     </a:xfrm>
                     <a:prstGeom prst="rect">
                       <a:avLst/>
@@ -7534,7 +7534,7 @@
       <w:r>
         <w:drawing>
           <wp:inline>
-            <wp:extent cx="5334000" cy="4041321"/>
+            <wp:extent cx="5943600" cy="4503186"/>
             <wp:effectExtent b="0" l="0" r="0" t="0"/>
             <wp:docPr descr="Diagram 3" title="" id="1" name="Picture"/>
             <a:graphic>
@@ -7555,7 +7555,7 @@
                   <pic:spPr bwMode="auto">
                     <a:xfrm>
                       <a:off x="0" y="0"/>
-                      <a:ext cx="5334000" cy="4041321"/>
+                      <a:ext cx="5943600" cy="4503186"/>
                     </a:xfrm>
                     <a:prstGeom prst="rect">
                       <a:avLst/>
@@ -7599,7 +7599,7 @@
       <w:r>
         <w:drawing>
           <wp:inline>
-            <wp:extent cx="5334000" cy="2000250"/>
+            <wp:extent cx="5943600" cy="2228850"/>
             <wp:effectExtent b="0" l="0" r="0" t="0"/>
             <wp:docPr descr="Diagram 4" title="" id="1" name="Picture"/>
             <a:graphic>
@@ -7620,7 +7620,7 @@
                   <pic:spPr bwMode="auto">
                     <a:xfrm>
                       <a:off x="0" y="0"/>
-                      <a:ext cx="5334000" cy="2000250"/>
+                      <a:ext cx="5943600" cy="2228850"/>
                     </a:xfrm>
                     <a:prstGeom prst="rect">
                       <a:avLst/>
@@ -7685,7 +7685,15 @@
         <w:t xml:space="preserve">.</w:t>
       </w:r>
     </w:p>
-    <w:sectPr/>
+    <w:sectPr>
+      <w:headerReference w:type="default" r:id="rId9"/>
+      <w:pgSz w:w="12240" w:h="15840"/>
+      <w:pgMar w:top="1440" w:right="1440" w:bottom="1440" w:left="1440" w:header="708" w:footer="708" w:gutter="0"/>
+      <w:pgNumType w:start="0"/>
+      <w:cols w:space="720"/>
+      <w:titlePg/>
+      <w:docGrid w:linePitch="360"/>
+    </w:sectPr>
   </w:body>
 </w:document>
 </file>
@@ -7694,6 +7702,106 @@
 <w:comments xmlns:w="http://schemas.openxmlformats.org/wordprocessingml/2006/main" xmlns:m="http://schemas.openxmlformats.org/officeDocument/2006/math" xmlns:r="http://schemas.openxmlformats.org/officeDocument/2006/relationships" xmlns:o="urn:schemas-microsoft-com:office:office" xmlns:v="urn:schemas-microsoft-com:vml" xmlns:w10="urn:schemas-microsoft-com:office:word" xmlns:a="http://schemas.openxmlformats.org/drawingml/2006/main" xmlns:pic="http://schemas.openxmlformats.org/drawingml/2006/picture" xmlns:wp="http://schemas.openxmlformats.org/drawingml/2006/wordprocessingDrawing"/>
 </file>
 
+<file path=word/footer1.xml><?xml version="1.0" encoding="utf-8"?>
+<w:ftr xmlns:wpc="http://schemas.microsoft.com/office/word/2010/wordprocessingCanvas" xmlns:cx="http://schemas.microsoft.com/office/drawing/2014/chartex" xmlns:cx1="http://schemas.microsoft.com/office/drawing/2015/9/8/chartex" xmlns:cx2="http://schemas.microsoft.com/office/drawing/2015/10/21/chartex" xmlns:cx3="http://schemas.microsoft.com/office/drawing/2016/5/9/chartex" xmlns:cx4="http://schemas.microsoft.com/office/drawing/2016/5/10/chartex" xmlns:cx5="http://schemas.microsoft.com/office/drawing/2016/5/11/chartex" xmlns:cx6="http://schemas.microsoft.com/office/drawing/2016/5/12/chartex" xmlns:cx7="http://schemas.microsoft.com/office/drawing/2016/5/13/chartex" xmlns:cx8="http://schemas.microsoft.com/office/drawing/2016/5/14/chartex" xmlns:mc="http://schemas.openxmlformats.org/markup-compatibility/2006" xmlns:aink="http://schemas.microsoft.com/office/drawing/2016/ink" xmlns:am3d="http://schemas.microsoft.com/office/drawing/2017/model3d" xmlns:o="urn:schemas-microsoft-com:office:office" xmlns:oel="http://schemas.microsoft.com/office/2019/extlst" xmlns:r="http://schemas.openxmlformats.org/officeDocument/2006/relationships" xmlns:m="http://schemas.openxmlformats.org/officeDocument/2006/math" xmlns:v="urn:schemas-microsoft-com:vml" xmlns:wp14="http://schemas.microsoft.com/office/word/2010/wordprocessingDrawing" xmlns:wp="http://schemas.openxmlformats.org/drawingml/2006/wordprocessingDrawing" xmlns:w10="urn:schemas-microsoft-com:office:word" xmlns:w="http://schemas.openxmlformats.org/wordprocessingml/2006/main" xmlns:w14="http://schemas.microsoft.com/office/word/2010/wordml" xmlns:w15="http://schemas.microsoft.com/office/word/2012/wordml" xmlns:w16cex="http://schemas.microsoft.com/office/word/2018/wordml/cex" xmlns:w16cid="http://schemas.microsoft.com/office/word/2016/wordml/cid" xmlns:w16="http://schemas.microsoft.com/office/word/2018/wordml" xmlns:w16du="http://schemas.microsoft.com/office/word/2023/wordml/word16du" xmlns:w16sdtdh="http://schemas.microsoft.com/office/word/2020/wordml/sdtdatahash" xmlns:w16sdtfl="http://schemas.microsoft.com/office/word/2024/wordml/sdtformatlock" xmlns:w16se="http://schemas.microsoft.com/office/word/2015/wordml/symex" xmlns:wpg="http://schemas.microsoft.com/office/word/2010/wordprocessingGroup" xmlns:wpi="http://schemas.microsoft.com/office/word/2010/wordprocessingInk" xmlns:wne="http://schemas.microsoft.com/office/word/2006/wordml" xmlns:wps="http://schemas.microsoft.com/office/word/2010/wordprocessingShape" mc:Ignorable="w14 w15 w16se w16cid w16 w16cex w16sdtdh w16sdtfl w16du wp14">
+  <w:p>
+    <w:pPr>
+      <w:jc w:val="center"/>
+    </w:pPr>
+    <w:r>
+      <w:rPr>
+        <w:color w:val="999999"/>
+        <w:sz w:val="18"/>
+        <w:szCs w:val="18"/>
+      </w:rPr>
+      <w:fldChar w:fldCharType="begin"/>
+    </w:r>
+    <w:r>
+      <w:rPr>
+        <w:color w:val="999999"/>
+        <w:sz w:val="18"/>
+        <w:szCs w:val="18"/>
+      </w:rPr>
+      <w:instrText>PAGE</w:instrText>
+    </w:r>
+    <w:r>
+      <w:rPr>
+        <w:color w:val="999999"/>
+        <w:sz w:val="18"/>
+        <w:szCs w:val="18"/>
+      </w:rPr>
+      <w:fldChar w:fldCharType="separate"/>
+    </w:r>
+    <w:r>
+      <w:rPr>
+        <w:color w:val="999999"/>
+        <w:sz w:val="18"/>
+        <w:szCs w:val="18"/>
+      </w:rPr>
+      <w:t>1</w:t>
+    </w:r>
+    <w:r>
+      <w:rPr>
+        <w:color w:val="999999"/>
+        <w:sz w:val="18"/>
+        <w:szCs w:val="18"/>
+      </w:rPr>
+      <w:fldChar w:fldCharType="end"/>
+    </w:r>
+  </w:p>
+</w:ftr>
+</file>
+
+<file path=word/footer2.xml><?xml version="1.0" encoding="utf-8"?>
+<w:ftr xmlns:wpc="http://schemas.microsoft.com/office/word/2010/wordprocessingCanvas" xmlns:cx="http://schemas.microsoft.com/office/drawing/2014/chartex" xmlns:cx1="http://schemas.microsoft.com/office/drawing/2015/9/8/chartex" xmlns:cx2="http://schemas.microsoft.com/office/drawing/2015/10/21/chartex" xmlns:cx3="http://schemas.microsoft.com/office/drawing/2016/5/9/chartex" xmlns:cx4="http://schemas.microsoft.com/office/drawing/2016/5/10/chartex" xmlns:cx5="http://schemas.microsoft.com/office/drawing/2016/5/11/chartex" xmlns:cx6="http://schemas.microsoft.com/office/drawing/2016/5/12/chartex" xmlns:cx7="http://schemas.microsoft.com/office/drawing/2016/5/13/chartex" xmlns:cx8="http://schemas.microsoft.com/office/drawing/2016/5/14/chartex" xmlns:mc="http://schemas.openxmlformats.org/markup-compatibility/2006" xmlns:aink="http://schemas.microsoft.com/office/drawing/2016/ink" xmlns:am3d="http://schemas.microsoft.com/office/drawing/2017/model3d" xmlns:o="urn:schemas-microsoft-com:office:office" xmlns:oel="http://schemas.microsoft.com/office/2019/extlst" xmlns:r="http://schemas.openxmlformats.org/officeDocument/2006/relationships" xmlns:m="http://schemas.openxmlformats.org/officeDocument/2006/math" xmlns:v="urn:schemas-microsoft-com:vml" xmlns:wp14="http://schemas.microsoft.com/office/word/2010/wordprocessingDrawing" xmlns:wp="http://schemas.openxmlformats.org/drawingml/2006/wordprocessingDrawing" xmlns:w10="urn:schemas-microsoft-com:office:word" xmlns:w="http://schemas.openxmlformats.org/wordprocessingml/2006/main" xmlns:w14="http://schemas.microsoft.com/office/word/2010/wordml" xmlns:w15="http://schemas.microsoft.com/office/word/2012/wordml" xmlns:w16cex="http://schemas.microsoft.com/office/word/2018/wordml/cex" xmlns:w16cid="http://schemas.microsoft.com/office/word/2016/wordml/cid" xmlns:w16="http://schemas.microsoft.com/office/word/2018/wordml" xmlns:w16du="http://schemas.microsoft.com/office/word/2023/wordml/word16du" xmlns:w16sdtdh="http://schemas.microsoft.com/office/word/2020/wordml/sdtdatahash" xmlns:w16sdtfl="http://schemas.microsoft.com/office/word/2024/wordml/sdtformatlock" xmlns:w16se="http://schemas.microsoft.com/office/word/2015/wordml/symex" xmlns:wpg="http://schemas.microsoft.com/office/word/2010/wordprocessingGroup" xmlns:wpi="http://schemas.microsoft.com/office/word/2010/wordprocessingInk" xmlns:wne="http://schemas.microsoft.com/office/word/2006/wordml" xmlns:wps="http://schemas.microsoft.com/office/word/2010/wordprocessingShape" mc:Ignorable="w14 w15 w16se w16cid w16 w16cex w16sdtdh w16sdtfl w16du wp14">
+  <w:p>
+    <w:pPr>
+      <w:jc w:val="center"/>
+    </w:pPr>
+    <w:r>
+      <w:rPr>
+        <w:color w:val="999999"/>
+        <w:sz w:val="18"/>
+        <w:szCs w:val="18"/>
+      </w:rPr>
+      <w:fldChar w:fldCharType="begin"/>
+    </w:r>
+    <w:r>
+      <w:rPr>
+        <w:color w:val="999999"/>
+        <w:sz w:val="18"/>
+        <w:szCs w:val="18"/>
+      </w:rPr>
+      <w:instrText>PAGE</w:instrText>
+    </w:r>
+    <w:r>
+      <w:rPr>
+        <w:color w:val="999999"/>
+        <w:sz w:val="18"/>
+        <w:szCs w:val="18"/>
+      </w:rPr>
+      <w:fldChar w:fldCharType="separate"/>
+    </w:r>
+    <w:r>
+      <w:rPr>
+        <w:color w:val="999999"/>
+        <w:sz w:val="18"/>
+        <w:szCs w:val="18"/>
+      </w:rPr>
+      <w:t>1</w:t>
+    </w:r>
+    <w:r>
+      <w:rPr>
+        <w:color w:val="999999"/>
+        <w:sz w:val="18"/>
+        <w:szCs w:val="18"/>
+      </w:rPr>
+      <w:fldChar w:fldCharType="end"/>
+    </w:r>
+  </w:p>
+</w:ftr>
+</file>
+
 <file path=word/footnotes.xml><?xml version="1.0" encoding="utf-8"?>
 <w:footnotes xmlns:w="http://schemas.openxmlformats.org/wordprocessingml/2006/main" xmlns:m="http://schemas.openxmlformats.org/officeDocument/2006/math" xmlns:r="http://schemas.openxmlformats.org/officeDocument/2006/relationships" xmlns:o="urn:schemas-microsoft-com:office:office" xmlns:v="urn:schemas-microsoft-com:vml" xmlns:w10="urn:schemas-microsoft-com:office:word" xmlns:a="http://schemas.openxmlformats.org/drawingml/2006/main" xmlns:pic="http://schemas.openxmlformats.org/drawingml/2006/picture" xmlns:wp="http://schemas.openxmlformats.org/drawingml/2006/wordprocessingDrawing">
   <w:footnote w:type="continuationSeparator" w:id="0">
@@ -7713,8 +7821,148 @@
 </w:footnotes>
 </file>
 
+<file path=word/header1.xml><?xml version="1.0" encoding="utf-8"?>
+<w:hdr xmlns:wpc="http://schemas.microsoft.com/office/word/2010/wordprocessingCanvas" xmlns:cx="http://schemas.microsoft.com/office/drawing/2014/chartex" xmlns:cx1="http://schemas.microsoft.com/office/drawing/2015/9/8/chartex" xmlns:cx2="http://schemas.microsoft.com/office/drawing/2015/10/21/chartex" xmlns:cx3="http://schemas.microsoft.com/office/drawing/2016/5/9/chartex" xmlns:cx4="http://schemas.microsoft.com/office/drawing/2016/5/10/chartex" xmlns:cx5="http://schemas.microsoft.com/office/drawing/2016/5/11/chartex" xmlns:cx6="http://schemas.microsoft.com/office/drawing/2016/5/12/chartex" xmlns:cx7="http://schemas.microsoft.com/office/drawing/2016/5/13/chartex" xmlns:cx8="http://schemas.microsoft.com/office/drawing/2016/5/14/chartex" xmlns:mc="http://schemas.openxmlformats.org/markup-compatibility/2006" xmlns:aink="http://schemas.microsoft.com/office/drawing/2016/ink" xmlns:am3d="http://schemas.microsoft.com/office/drawing/2017/model3d" xmlns:o="urn:schemas-microsoft-com:office:office" xmlns:oel="http://schemas.microsoft.com/office/2019/extlst" xmlns:r="http://schemas.openxmlformats.org/officeDocument/2006/relationships" xmlns:m="http://schemas.openxmlformats.org/officeDocument/2006/math" xmlns:v="urn:schemas-microsoft-com:vml" xmlns:wp14="http://schemas.microsoft.com/office/word/2010/wordprocessingDrawing" xmlns:wp="http://schemas.openxmlformats.org/drawingml/2006/wordprocessingDrawing" xmlns:w10="urn:schemas-microsoft-com:office:word" xmlns:w="http://schemas.openxmlformats.org/wordprocessingml/2006/main" xmlns:w14="http://schemas.microsoft.com/office/word/2010/wordml" xmlns:w15="http://schemas.microsoft.com/office/word/2012/wordml" xmlns:w16cex="http://schemas.microsoft.com/office/word/2018/wordml/cex" xmlns:w16cid="http://schemas.microsoft.com/office/word/2016/wordml/cid" xmlns:w16="http://schemas.microsoft.com/office/word/2018/wordml" xmlns:w16du="http://schemas.microsoft.com/office/word/2023/wordml/word16du" xmlns:w16sdtdh="http://schemas.microsoft.com/office/word/2020/wordml/sdtdatahash" xmlns:w16sdtfl="http://schemas.microsoft.com/office/word/2024/wordml/sdtformatlock" xmlns:w16se="http://schemas.microsoft.com/office/word/2015/wordml/symex" xmlns:wpg="http://schemas.microsoft.com/office/word/2010/wordprocessingGroup" xmlns:wpi="http://schemas.microsoft.com/office/word/2010/wordprocessingInk" xmlns:wne="http://schemas.microsoft.com/office/word/2006/wordml" xmlns:wps="http://schemas.microsoft.com/office/word/2010/wordprocessingShape" mc:Ignorable="w14 w15 w16se w16cid w16 w16cex w16sdtdh w16sdtfl w16du wp14">
+  <w:p>
+    <w:pPr>
+      <w:jc w:val="right"/>
+    </w:pPr>
+    <w:r>
+      <w:rPr>
+        <w:color w:val="999999"/>
+        <w:sz w:val="16"/>
+        <w:szCs w:val="16"/>
+      </w:rPr>
+      <w:t>Panduan Pengguna — Executive Dashboard</w:t>
+    </w:r>
+  </w:p>
+</w:hdr>
+</file>
+
+<file path=word/header2.xml><?xml version="1.0" encoding="utf-8"?>
+<w:hdr xmlns:wpc="http://schemas.microsoft.com/office/word/2010/wordprocessingCanvas" xmlns:cx="http://schemas.microsoft.com/office/drawing/2014/chartex" xmlns:cx1="http://schemas.microsoft.com/office/drawing/2015/9/8/chartex" xmlns:cx2="http://schemas.microsoft.com/office/drawing/2015/10/21/chartex" xmlns:cx3="http://schemas.microsoft.com/office/drawing/2016/5/9/chartex" xmlns:cx4="http://schemas.microsoft.com/office/drawing/2016/5/10/chartex" xmlns:cx5="http://schemas.microsoft.com/office/drawing/2016/5/11/chartex" xmlns:cx6="http://schemas.microsoft.com/office/drawing/2016/5/12/chartex" xmlns:cx7="http://schemas.microsoft.com/office/drawing/2016/5/13/chartex" xmlns:cx8="http://schemas.microsoft.com/office/drawing/2016/5/14/chartex" xmlns:mc="http://schemas.openxmlformats.org/markup-compatibility/2006" xmlns:aink="http://schemas.microsoft.com/office/drawing/2016/ink" xmlns:am3d="http://schemas.microsoft.com/office/drawing/2017/model3d" xmlns:o="urn:schemas-microsoft-com:office:office" xmlns:oel="http://schemas.microsoft.com/office/2019/extlst" xmlns:r="http://schemas.openxmlformats.org/officeDocument/2006/relationships" xmlns:m="http://schemas.openxmlformats.org/officeDocument/2006/math" xmlns:v="urn:schemas-microsoft-com:vml" xmlns:wp14="http://schemas.microsoft.com/office/word/2010/wordprocessingDrawing" xmlns:wp="http://schemas.openxmlformats.org/drawingml/2006/wordprocessingDrawing" xmlns:w10="urn:schemas-microsoft-com:office:word" xmlns:w="http://schemas.openxmlformats.org/wordprocessingml/2006/main" xmlns:w14="http://schemas.microsoft.com/office/word/2010/wordml" xmlns:w15="http://schemas.microsoft.com/office/word/2012/wordml" xmlns:w16cex="http://schemas.microsoft.com/office/word/2018/wordml/cex" xmlns:w16cid="http://schemas.microsoft.com/office/word/2016/wordml/cid" xmlns:w16="http://schemas.microsoft.com/office/word/2018/wordml" xmlns:w16du="http://schemas.microsoft.com/office/word/2023/wordml/word16du" xmlns:w16sdtdh="http://schemas.microsoft.com/office/word/2020/wordml/sdtdatahash" xmlns:w16sdtfl="http://schemas.microsoft.com/office/word/2024/wordml/sdtformatlock" xmlns:w16se="http://schemas.microsoft.com/office/word/2015/wordml/symex" xmlns:wpg="http://schemas.microsoft.com/office/word/2010/wordprocessingGroup" xmlns:wpi="http://schemas.microsoft.com/office/word/2010/wordprocessingInk" xmlns:wne="http://schemas.microsoft.com/office/word/2006/wordml" xmlns:wps="http://schemas.microsoft.com/office/word/2010/wordprocessingShape" mc:Ignorable="w14 w15 w16se w16cid w16 w16cex w16sdtdh w16sdtfl w16du wp14">
+  <w:p>
+    <w:pPr>
+      <w:jc w:val="right"/>
+    </w:pPr>
+    <w:r>
+      <w:rPr>
+        <w:color w:val="999999"/>
+        <w:sz w:val="16"/>
+        <w:szCs w:val="16"/>
+      </w:rPr>
+      <w:t>Panduan Pengguna — Executive Dashboard</w:t>
+    </w:r>
+  </w:p>
+</w:hdr>
+</file>
+
+<file path=word/header3.xml><?xml version="1.0" encoding="utf-8"?>
+<w:hdr xmlns:wpc="http://schemas.microsoft.com/office/word/2010/wordprocessingCanvas" xmlns:cx="http://schemas.microsoft.com/office/drawing/2014/chartex" xmlns:cx1="http://schemas.microsoft.com/office/drawing/2015/9/8/chartex" xmlns:cx2="http://schemas.microsoft.com/office/drawing/2015/10/21/chartex" xmlns:cx3="http://schemas.microsoft.com/office/drawing/2016/5/9/chartex" xmlns:cx4="http://schemas.microsoft.com/office/drawing/2016/5/10/chartex" xmlns:cx5="http://schemas.microsoft.com/office/drawing/2016/5/11/chartex" xmlns:cx6="http://schemas.microsoft.com/office/drawing/2016/5/12/chartex" xmlns:cx7="http://schemas.microsoft.com/office/drawing/2016/5/13/chartex" xmlns:cx8="http://schemas.microsoft.com/office/drawing/2016/5/14/chartex" xmlns:mc="http://schemas.openxmlformats.org/markup-compatibility/2006" xmlns:aink="http://schemas.microsoft.com/office/drawing/2016/ink" xmlns:am3d="http://schemas.microsoft.com/office/drawing/2017/model3d" xmlns:o="urn:schemas-microsoft-com:office:office" xmlns:oel="http://schemas.microsoft.com/office/2019/extlst" xmlns:r="http://schemas.openxmlformats.org/officeDocument/2006/relationships" xmlns:m="http://schemas.openxmlformats.org/officeDocument/2006/math" xmlns:v="urn:schemas-microsoft-com:vml" xmlns:wp14="http://schemas.microsoft.com/office/word/2010/wordprocessingDrawing" xmlns:wp="http://schemas.openxmlformats.org/drawingml/2006/wordprocessingDrawing" xmlns:w10="urn:schemas-microsoft-com:office:word" xmlns:w="http://schemas.openxmlformats.org/wordprocessingml/2006/main" xmlns:w14="http://schemas.microsoft.com/office/word/2010/wordml" xmlns:w15="http://schemas.microsoft.com/office/word/2012/wordml" xmlns:w16cex="http://schemas.microsoft.com/office/word/2018/wordml/cex" xmlns:w16cid="http://schemas.microsoft.com/office/word/2016/wordml/cid" xmlns:w16="http://schemas.microsoft.com/office/word/2018/wordml" xmlns:w16du="http://schemas.microsoft.com/office/word/2023/wordml/word16du" xmlns:w16sdtdh="http://schemas.microsoft.com/office/word/2020/wordml/sdtdatahash" xmlns:w16sdtfl="http://schemas.microsoft.com/office/word/2024/wordml/sdtformatlock" xmlns:w16se="http://schemas.microsoft.com/office/word/2015/wordml/symex" xmlns:wpg="http://schemas.microsoft.com/office/word/2010/wordprocessingGroup" xmlns:wpi="http://schemas.microsoft.com/office/word/2010/wordprocessingInk" xmlns:wne="http://schemas.microsoft.com/office/word/2006/wordml" xmlns:wps="http://schemas.microsoft.com/office/word/2010/wordprocessingShape" mc:Ignorable="w14 w15 w16se w16cid w16 w16cex w16sdtdh w16sdtfl w16du wp14">
+  <w:p>
+    <w:pPr>
+      <w:jc w:val="right"/>
+    </w:pPr>
+    <w:r>
+      <w:rPr>
+        <w:color w:val="999999"/>
+        <w:sz w:val="16"/>
+        <w:szCs w:val="16"/>
+      </w:rPr>
+      <w:t>Panduan Pengguna — Executive Dashboard</w:t>
+    </w:r>
+  </w:p>
+</w:hdr>
+</file>
+
 <file path=word/numbering.xml><?xml version="1.0" encoding="utf-8"?>
-<w:numbering xmlns:w="http://schemas.openxmlformats.org/wordprocessingml/2006/main">
+<w:numbering xmlns:wpc="http://schemas.microsoft.com/office/word/2010/wordprocessingCanvas" xmlns:cx="http://schemas.microsoft.com/office/drawing/2014/chartex" xmlns:cx1="http://schemas.microsoft.com/office/drawing/2015/9/8/chartex" xmlns:cx2="http://schemas.microsoft.com/office/drawing/2015/10/21/chartex" xmlns:cx3="http://schemas.microsoft.com/office/drawing/2016/5/9/chartex" xmlns:cx4="http://schemas.microsoft.com/office/drawing/2016/5/10/chartex" xmlns:cx5="http://schemas.microsoft.com/office/drawing/2016/5/11/chartex" xmlns:cx6="http://schemas.microsoft.com/office/drawing/2016/5/12/chartex" xmlns:cx7="http://schemas.microsoft.com/office/drawing/2016/5/13/chartex" xmlns:cx8="http://schemas.microsoft.com/office/drawing/2016/5/14/chartex" xmlns:mc="http://schemas.openxmlformats.org/markup-compatibility/2006" xmlns:aink="http://schemas.microsoft.com/office/drawing/2016/ink" xmlns:am3d="http://schemas.microsoft.com/office/drawing/2017/model3d" xmlns:o="urn:schemas-microsoft-com:office:office" xmlns:oel="http://schemas.microsoft.com/office/2019/extlst" xmlns:r="http://schemas.openxmlformats.org/officeDocument/2006/relationships" xmlns:m="http://schemas.openxmlformats.org/officeDocument/2006/math" xmlns:v="urn:schemas-microsoft-com:vml" xmlns:wp14="http://schemas.microsoft.com/office/word/2010/wordprocessingDrawing" xmlns:wp="http://schemas.openxmlformats.org/drawingml/2006/wordprocessingDrawing" xmlns:w10="urn:schemas-microsoft-com:office:word" xmlns:w="http://schemas.openxmlformats.org/wordprocessingml/2006/main" xmlns:w14="http://schemas.microsoft.com/office/word/2010/wordml" xmlns:w15="http://schemas.microsoft.com/office/word/2012/wordml" xmlns:w16cex="http://schemas.microsoft.com/office/word/2018/wordml/cex" xmlns:w16cid="http://schemas.microsoft.com/office/word/2016/wordml/cid" xmlns:w16="http://schemas.microsoft.com/office/word/2018/wordml" xmlns:w16du="http://schemas.microsoft.com/office/word/2023/wordml/word16du" xmlns:w16sdtdh="http://schemas.microsoft.com/office/word/2020/wordml/sdtdatahash" xmlns:w16sdtfl="http://schemas.microsoft.com/office/word/2024/wordml/sdtformatlock" xmlns:w16se="http://schemas.microsoft.com/office/word/2015/wordml/symex" xmlns:wpg="http://schemas.microsoft.com/office/word/2010/wordprocessingGroup" xmlns:wpi="http://schemas.microsoft.com/office/word/2010/wordprocessingInk" xmlns:wne="http://schemas.microsoft.com/office/word/2006/wordml" xmlns:wps="http://schemas.microsoft.com/office/word/2010/wordprocessingShape" mc:Ignorable="w14 w15 w16se w16cid w16 w16cex w16sdtdh w16sdtfl w16du wp14">
+  <w:abstractNum w:abstractNumId="0" w15:restartNumberingAfterBreak="0">
+    <w:nsid w:val="6C247D98"/>
+    <w:multiLevelType w:val="hybridMultilevel"/>
+    <w:tmpl w:val="0B867222"/>
+    <w:lvl w:ilvl="0" w:tplc="EA6E11DE">
+      <w:start w:val="1"/>
+      <w:numFmt w:val="bullet"/>
+      <w:lvlText w:val="●"/>
+      <w:lvlJc w:val="left"/>
+      <w:pPr>
+        <w:ind w:left="720" w:hanging="360"/>
+      </w:pPr>
+    </w:lvl>
+    <w:lvl w:ilvl="1" w:tplc="C92AD9A4">
+      <w:start w:val="1"/>
+      <w:numFmt w:val="bullet"/>
+      <w:lvlText w:val="○"/>
+      <w:lvlJc w:val="left"/>
+      <w:pPr>
+        <w:ind w:left="1440" w:hanging="360"/>
+      </w:pPr>
+    </w:lvl>
+    <w:lvl w:ilvl="2" w:tplc="0AA6DAD8">
+      <w:start w:val="1"/>
+      <w:numFmt w:val="bullet"/>
+      <w:lvlText w:val="■"/>
+      <w:lvlJc w:val="left"/>
+      <w:pPr>
+        <w:ind w:left="2160" w:hanging="360"/>
+      </w:pPr>
+    </w:lvl>
+    <w:lvl w:ilvl="3" w:tplc="19AAEF86">
+      <w:start w:val="1"/>
+      <w:numFmt w:val="bullet"/>
+      <w:lvlText w:val="●"/>
+      <w:lvlJc w:val="left"/>
+      <w:pPr>
+        <w:ind w:left="2880" w:hanging="360"/>
+      </w:pPr>
+    </w:lvl>
+    <w:lvl w:ilvl="4" w:tplc="97F28B0A">
+      <w:start w:val="1"/>
+      <w:numFmt w:val="bullet"/>
+      <w:lvlText w:val="○"/>
+      <w:lvlJc w:val="left"/>
+      <w:pPr>
+        <w:ind w:left="3600" w:hanging="360"/>
+      </w:pPr>
+    </w:lvl>
+    <w:lvl w:ilvl="5" w:tplc="8BC0E612">
+      <w:start w:val="1"/>
+      <w:numFmt w:val="bullet"/>
+      <w:lvlText w:val="■"/>
+      <w:lvlJc w:val="left"/>
+      <w:pPr>
+        <w:ind w:left="4320" w:hanging="360"/>
+      </w:pPr>
+    </w:lvl>
+    <w:lvl w:ilvl="6" w:tplc="F848A8FE">
+      <w:start w:val="1"/>
+      <w:numFmt w:val="bullet"/>
+      <w:lvlText w:val="●"/>
+      <w:lvlJc w:val="left"/>
+      <w:pPr>
+        <w:ind w:left="5040" w:hanging="360"/>
+      </w:pPr>
+    </w:lvl>
+    <w:lvl w:ilvl="7" w:tplc="C67AE8DC">
+      <w:start w:val="1"/>
+      <w:numFmt w:val="bullet"/>
+      <w:lvlText w:val="●"/>
+      <w:lvlJc w:val="left"/>
+      <w:pPr>
+        <w:ind w:left="5760" w:hanging="360"/>
+      </w:pPr>
+    </w:lvl>
+    <w:lvl w:ilvl="8" w:tplc="C972D386">
+      <w:start w:val="1"/>
+      <w:numFmt w:val="bullet"/>
+      <w:lvlText w:val="●"/>
+      <w:lvlJc w:val="left"/>
+      <w:pPr>
+        <w:ind w:left="6480" w:hanging="360"/>
+      </w:pPr>
+    </w:lvl>
+  </w:abstractNum>
   <w:abstractNum w:abstractNumId="990">
     <w:nsid w:val="2c1ae401"/>
     <w:multiLevelType w:val="multilevel"/>
@@ -8033,6 +8281,12 @@
       </w:pPr>
     </w:lvl>
   </w:abstractNum>
+  <w:num w:numId="1" w16cid:durableId="1984390043">
+    <w:abstractNumId w:val="0"/>
+    <w:lvlOverride w:ilvl="0">
+      <w:startOverride w:val="1"/>
+    </w:lvlOverride>
+  </w:num>
   <w:num w:numId="1000">
     <w:abstractNumId w:val="990"/>
   </w:num>
@@ -8136,348 +8390,502 @@
 </file>
 
 <file path=word/styles.xml><?xml version="1.0" encoding="utf-8"?>
-<w:styles xmlns:r="http://schemas.openxmlformats.org/officeDocument/2006/relationships" xmlns:w="http://schemas.openxmlformats.org/wordprocessingml/2006/main">
+<w:styles xmlns:mc="http://schemas.openxmlformats.org/markup-compatibility/2006" xmlns:r="http://schemas.openxmlformats.org/officeDocument/2006/relationships" xmlns:w="http://schemas.openxmlformats.org/wordprocessingml/2006/main" xmlns:w14="http://schemas.microsoft.com/office/word/2010/wordml" xmlns:w15="http://schemas.microsoft.com/office/word/2012/wordml" xmlns:w16cex="http://schemas.microsoft.com/office/word/2018/wordml/cex" xmlns:w16cid="http://schemas.microsoft.com/office/word/2016/wordml/cid" xmlns:w16="http://schemas.microsoft.com/office/word/2018/wordml" xmlns:w16du="http://schemas.microsoft.com/office/word/2023/wordml/word16du" xmlns:w16sdtdh="http://schemas.microsoft.com/office/word/2020/wordml/sdtdatahash" xmlns:w16sdtfl="http://schemas.microsoft.com/office/word/2024/wordml/sdtformatlock" xmlns:w16se="http://schemas.microsoft.com/office/word/2015/wordml/symex" mc:Ignorable="w14 w15 w16se w16cid w16 w16cex w16sdtdh w16sdtfl w16du">
   <w:docDefaults>
     <w:rPrDefault>
       <w:rPr>
-        <w:rFonts w:asciiTheme="minorHAnsi" w:eastAsiaTheme="minorHAnsi" w:hAnsiTheme="minorHAnsi" w:cstheme="minorBidi"/>
-        <w:sz w:val="24"/>
-        <w:szCs w:val="24"/>
+        <w:rFonts w:ascii="Calibri" w:eastAsia="Calibri" w:hAnsi="Calibri" w:cs="Calibri"/>
+        <w:sz w:val="22"/>
+        <w:szCs w:val="22"/>
         <w:lang w:val="en-US" w:eastAsia="en-US" w:bidi="ar-SA"/>
       </w:rPr>
     </w:rPrDefault>
-    <w:pPrDefault>
-      <w:pPr>
-        <w:spacing w:after="200"/>
-      </w:pPr>
-    </w:pPrDefault>
+    <w:pPrDefault/>
   </w:docDefaults>
-  <w:latentStyles w:defLockedState="0" w:defUIPriority="0" w:defSemiHidden="0" w:defUnhideWhenUsed="0" w:defQFormat="0" w:count="276"/>
+  <w:latentStyles w:defLockedState="0" w:defUIPriority="99" w:defSemiHidden="0" w:defUnhideWhenUsed="0" w:defQFormat="0" w:count="376">
+    <w:lsdException w:name="Normal" w:uiPriority="0" w:qFormat="1"/>
+    <w:lsdException w:name="heading 1" w:uiPriority="9" w:qFormat="1"/>
+    <w:lsdException w:name="heading 2" w:semiHidden="1" w:uiPriority="9" w:unhideWhenUsed="1" w:qFormat="1"/>
+    <w:lsdException w:name="heading 3" w:semiHidden="1" w:uiPriority="9" w:unhideWhenUsed="1" w:qFormat="1"/>
+    <w:lsdException w:name="heading 4" w:semiHidden="1" w:uiPriority="9" w:unhideWhenUsed="1" w:qFormat="1"/>
+    <w:lsdException w:name="heading 5" w:semiHidden="1" w:uiPriority="9" w:unhideWhenUsed="1" w:qFormat="1"/>
+    <w:lsdException w:name="heading 6" w:semiHidden="1" w:uiPriority="9" w:unhideWhenUsed="1" w:qFormat="1"/>
+    <w:lsdException w:name="heading 7" w:semiHidden="1" w:uiPriority="9" w:unhideWhenUsed="1" w:qFormat="1"/>
+    <w:lsdException w:name="heading 8" w:semiHidden="1" w:uiPriority="9" w:unhideWhenUsed="1" w:qFormat="1"/>
+    <w:lsdException w:name="heading 9" w:semiHidden="1" w:uiPriority="9" w:unhideWhenUsed="1" w:qFormat="1"/>
+    <w:lsdException w:name="index 1" w:semiHidden="1" w:unhideWhenUsed="1"/>
+    <w:lsdException w:name="index 2" w:semiHidden="1" w:unhideWhenUsed="1"/>
+    <w:lsdException w:name="index 3" w:semiHidden="1" w:unhideWhenUsed="1"/>
+    <w:lsdException w:name="index 4" w:semiHidden="1" w:unhideWhenUsed="1"/>
+    <w:lsdException w:name="index 5" w:semiHidden="1" w:unhideWhenUsed="1"/>
+    <w:lsdException w:name="index 6" w:semiHidden="1" w:unhideWhenUsed="1"/>
+    <w:lsdException w:name="index 7" w:semiHidden="1" w:unhideWhenUsed="1"/>
+    <w:lsdException w:name="index 8" w:semiHidden="1" w:unhideWhenUsed="1"/>
+    <w:lsdException w:name="index 9" w:semiHidden="1" w:unhideWhenUsed="1"/>
+    <w:lsdException w:name="toc 1" w:semiHidden="1" w:uiPriority="39" w:unhideWhenUsed="1"/>
+    <w:lsdException w:name="toc 2" w:semiHidden="1" w:uiPriority="39" w:unhideWhenUsed="1"/>
+    <w:lsdException w:name="toc 3" w:semiHidden="1" w:uiPriority="39" w:unhideWhenUsed="1"/>
+    <w:lsdException w:name="toc 4" w:semiHidden="1" w:uiPriority="39" w:unhideWhenUsed="1"/>
+    <w:lsdException w:name="toc 5" w:semiHidden="1" w:uiPriority="39" w:unhideWhenUsed="1"/>
+    <w:lsdException w:name="toc 6" w:semiHidden="1" w:uiPriority="39" w:unhideWhenUsed="1"/>
+    <w:lsdException w:name="toc 7" w:semiHidden="1" w:uiPriority="39" w:unhideWhenUsed="1"/>
+    <w:lsdException w:name="toc 8" w:semiHidden="1" w:uiPriority="39" w:unhideWhenUsed="1"/>
+    <w:lsdException w:name="toc 9" w:semiHidden="1" w:uiPriority="39" w:unhideWhenUsed="1"/>
+    <w:lsdException w:name="Normal Indent" w:semiHidden="1" w:unhideWhenUsed="1"/>
+    <w:lsdException w:name="footnote text" w:semiHidden="1" w:unhideWhenUsed="1"/>
+    <w:lsdException w:name="annotation text" w:semiHidden="1" w:unhideWhenUsed="1"/>
+    <w:lsdException w:name="header" w:semiHidden="1" w:unhideWhenUsed="1"/>
+    <w:lsdException w:name="footer" w:semiHidden="1" w:unhideWhenUsed="1"/>
+    <w:lsdException w:name="index heading" w:semiHidden="1" w:unhideWhenUsed="1"/>
+    <w:lsdException w:name="caption" w:semiHidden="1" w:uiPriority="35" w:unhideWhenUsed="1" w:qFormat="1"/>
+    <w:lsdException w:name="table of figures" w:semiHidden="1" w:unhideWhenUsed="1"/>
+    <w:lsdException w:name="envelope address" w:semiHidden="1" w:unhideWhenUsed="1"/>
+    <w:lsdException w:name="envelope return" w:semiHidden="1" w:unhideWhenUsed="1"/>
+    <w:lsdException w:name="footnote reference" w:semiHidden="1" w:unhideWhenUsed="1"/>
+    <w:lsdException w:name="annotation reference" w:semiHidden="1" w:unhideWhenUsed="1"/>
+    <w:lsdException w:name="line number" w:semiHidden="1" w:unhideWhenUsed="1"/>
+    <w:lsdException w:name="page number" w:semiHidden="1" w:unhideWhenUsed="1"/>
+    <w:lsdException w:name="endnote reference" w:semiHidden="1" w:unhideWhenUsed="1"/>
+    <w:lsdException w:name="endnote text" w:semiHidden="1" w:unhideWhenUsed="1"/>
+    <w:lsdException w:name="table of authorities" w:semiHidden="1" w:unhideWhenUsed="1"/>
+    <w:lsdException w:name="macro" w:semiHidden="1" w:unhideWhenUsed="1"/>
+    <w:lsdException w:name="toa heading" w:semiHidden="1" w:unhideWhenUsed="1"/>
+    <w:lsdException w:name="List" w:semiHidden="1" w:unhideWhenUsed="1"/>
+    <w:lsdException w:name="List Bullet" w:semiHidden="1" w:unhideWhenUsed="1"/>
+    <w:lsdException w:name="List Number" w:semiHidden="1" w:unhideWhenUsed="1"/>
+    <w:lsdException w:name="List 2" w:semiHidden="1" w:unhideWhenUsed="1"/>
+    <w:lsdException w:name="List 3" w:semiHidden="1" w:unhideWhenUsed="1"/>
+    <w:lsdException w:name="List 4" w:semiHidden="1" w:unhideWhenUsed="1"/>
+    <w:lsdException w:name="List 5" w:semiHidden="1" w:unhideWhenUsed="1"/>
+    <w:lsdException w:name="List Bullet 2" w:semiHidden="1" w:unhideWhenUsed="1"/>
+    <w:lsdException w:name="List Bullet 3" w:semiHidden="1" w:unhideWhenUsed="1"/>
+    <w:lsdException w:name="List Bullet 4" w:semiHidden="1" w:unhideWhenUsed="1"/>
+    <w:lsdException w:name="List Bullet 5" w:semiHidden="1" w:unhideWhenUsed="1"/>
+    <w:lsdException w:name="List Number 2" w:semiHidden="1" w:unhideWhenUsed="1"/>
+    <w:lsdException w:name="List Number 3" w:semiHidden="1" w:unhideWhenUsed="1"/>
+    <w:lsdException w:name="List Number 4" w:semiHidden="1" w:unhideWhenUsed="1"/>
+    <w:lsdException w:name="List Number 5" w:semiHidden="1" w:unhideWhenUsed="1"/>
+    <w:lsdException w:name="Title" w:uiPriority="10" w:qFormat="1"/>
+    <w:lsdException w:name="Closing" w:semiHidden="1" w:unhideWhenUsed="1"/>
+    <w:lsdException w:name="Signature" w:semiHidden="1" w:unhideWhenUsed="1"/>
+    <w:lsdException w:name="Default Paragraph Font" w:semiHidden="1" w:uiPriority="1" w:unhideWhenUsed="1"/>
+    <w:lsdException w:name="Body Text" w:semiHidden="1" w:unhideWhenUsed="1"/>
+    <w:lsdException w:name="Body Text Indent" w:semiHidden="1" w:unhideWhenUsed="1"/>
+    <w:lsdException w:name="List Continue" w:semiHidden="1" w:unhideWhenUsed="1"/>
+    <w:lsdException w:name="List Continue 2" w:semiHidden="1" w:unhideWhenUsed="1"/>
+    <w:lsdException w:name="List Continue 3" w:semiHidden="1" w:unhideWhenUsed="1"/>
+    <w:lsdException w:name="List Continue 4" w:semiHidden="1" w:unhideWhenUsed="1"/>
+    <w:lsdException w:name="List Continue 5" w:semiHidden="1" w:unhideWhenUsed="1"/>
+    <w:lsdException w:name="Message Header" w:semiHidden="1" w:unhideWhenUsed="1"/>
+    <w:lsdException w:name="Subtitle" w:uiPriority="11" w:qFormat="1"/>
+    <w:lsdException w:name="Salutation" w:semiHidden="1" w:unhideWhenUsed="1"/>
+    <w:lsdException w:name="Date" w:semiHidden="1" w:unhideWhenUsed="1"/>
+    <w:lsdException w:name="Body Text First Indent" w:semiHidden="1" w:unhideWhenUsed="1"/>
+    <w:lsdException w:name="Body Text First Indent 2" w:semiHidden="1" w:unhideWhenUsed="1"/>
+    <w:lsdException w:name="Note Heading" w:semiHidden="1" w:unhideWhenUsed="1"/>
+    <w:lsdException w:name="Body Text 2" w:semiHidden="1" w:unhideWhenUsed="1"/>
+    <w:lsdException w:name="Body Text 3" w:semiHidden="1" w:unhideWhenUsed="1"/>
+    <w:lsdException w:name="Body Text Indent 2" w:semiHidden="1" w:unhideWhenUsed="1"/>
+    <w:lsdException w:name="Body Text Indent 3" w:semiHidden="1" w:unhideWhenUsed="1"/>
+    <w:lsdException w:name="Block Text" w:semiHidden="1" w:unhideWhenUsed="1"/>
+    <w:lsdException w:name="Hyperlink" w:semiHidden="1" w:unhideWhenUsed="1"/>
+    <w:lsdException w:name="FollowedHyperlink" w:semiHidden="1" w:unhideWhenUsed="1"/>
+    <w:lsdException w:name="Strong" w:uiPriority="22" w:qFormat="1"/>
+    <w:lsdException w:name="Emphasis" w:uiPriority="20" w:qFormat="1"/>
+    <w:lsdException w:name="Document Map" w:semiHidden="1" w:unhideWhenUsed="1"/>
+    <w:lsdException w:name="Plain Text" w:semiHidden="1" w:unhideWhenUsed="1"/>
+    <w:lsdException w:name="E-mail Signature" w:semiHidden="1" w:unhideWhenUsed="1"/>
+    <w:lsdException w:name="HTML Top of Form" w:semiHidden="1" w:unhideWhenUsed="1"/>
+    <w:lsdException w:name="HTML Bottom of Form" w:semiHidden="1" w:unhideWhenUsed="1"/>
+    <w:lsdException w:name="Normal (Web)" w:semiHidden="1" w:unhideWhenUsed="1"/>
+    <w:lsdException w:name="HTML Acronym" w:semiHidden="1" w:unhideWhenUsed="1"/>
+    <w:lsdException w:name="HTML Address" w:semiHidden="1" w:unhideWhenUsed="1"/>
+    <w:lsdException w:name="HTML Cite" w:semiHidden="1" w:unhideWhenUsed="1"/>
+    <w:lsdException w:name="HTML Code" w:semiHidden="1" w:unhideWhenUsed="1"/>
+    <w:lsdException w:name="HTML Definition" w:semiHidden="1" w:unhideWhenUsed="1"/>
+    <w:lsdException w:name="HTML Keyboard" w:semiHidden="1" w:unhideWhenUsed="1"/>
+    <w:lsdException w:name="HTML Preformatted" w:semiHidden="1" w:unhideWhenUsed="1"/>
+    <w:lsdException w:name="HTML Sample" w:semiHidden="1" w:unhideWhenUsed="1"/>
+    <w:lsdException w:name="HTML Typewriter" w:semiHidden="1" w:unhideWhenUsed="1"/>
+    <w:lsdException w:name="HTML Variable" w:semiHidden="1" w:unhideWhenUsed="1"/>
+    <w:lsdException w:name="Normal Table" w:semiHidden="1" w:unhideWhenUsed="1"/>
+    <w:lsdException w:name="annotation subject" w:semiHidden="1" w:unhideWhenUsed="1"/>
+    <w:lsdException w:name="No List" w:semiHidden="1" w:unhideWhenUsed="1"/>
+    <w:lsdException w:name="Outline List 1" w:semiHidden="1" w:unhideWhenUsed="1"/>
+    <w:lsdException w:name="Outline List 2" w:semiHidden="1" w:unhideWhenUsed="1"/>
+    <w:lsdException w:name="Outline List 3" w:semiHidden="1" w:unhideWhenUsed="1"/>
+    <w:lsdException w:name="Table Simple 1" w:semiHidden="1" w:unhideWhenUsed="1"/>
+    <w:lsdException w:name="Table Simple 2" w:semiHidden="1" w:unhideWhenUsed="1"/>
+    <w:lsdException w:name="Table Simple 3" w:semiHidden="1" w:unhideWhenUsed="1"/>
+    <w:lsdException w:name="Table Classic 1" w:semiHidden="1" w:unhideWhenUsed="1"/>
+    <w:lsdException w:name="Table Classic 2" w:semiHidden="1" w:unhideWhenUsed="1"/>
+    <w:lsdException w:name="Table Classic 3" w:semiHidden="1" w:unhideWhenUsed="1"/>
+    <w:lsdException w:name="Table Classic 4" w:semiHidden="1" w:unhideWhenUsed="1"/>
+    <w:lsdException w:name="Table Colorful 1" w:semiHidden="1" w:unhideWhenUsed="1"/>
+    <w:lsdException w:name="Table Colorful 2" w:semiHidden="1" w:unhideWhenUsed="1"/>
+    <w:lsdException w:name="Table Colorful 3" w:semiHidden="1" w:unhideWhenUsed="1"/>
+    <w:lsdException w:name="Table Columns 1" w:semiHidden="1" w:unhideWhenUsed="1"/>
+    <w:lsdException w:name="Table Columns 2" w:semiHidden="1" w:unhideWhenUsed="1"/>
+    <w:lsdException w:name="Table Columns 3" w:semiHidden="1" w:unhideWhenUsed="1"/>
+    <w:lsdException w:name="Table Columns 4" w:semiHidden="1" w:unhideWhenUsed="1"/>
+    <w:lsdException w:name="Table Columns 5" w:semiHidden="1" w:unhideWhenUsed="1"/>
+    <w:lsdException w:name="Table Grid 1" w:semiHidden="1" w:unhideWhenUsed="1"/>
+    <w:lsdException w:name="Table Grid 2" w:semiHidden="1" w:unhideWhenUsed="1"/>
+    <w:lsdException w:name="Table Grid 3" w:semiHidden="1" w:unhideWhenUsed="1"/>
+    <w:lsdException w:name="Table Grid 4" w:semiHidden="1" w:unhideWhenUsed="1"/>
+    <w:lsdException w:name="Table Grid 5" w:semiHidden="1" w:unhideWhenUsed="1"/>
+    <w:lsdException w:name="Table Grid 6" w:semiHidden="1" w:unhideWhenUsed="1"/>
+    <w:lsdException w:name="Table Grid 7" w:semiHidden="1" w:unhideWhenUsed="1"/>
+    <w:lsdException w:name="Table Grid 8" w:semiHidden="1" w:unhideWhenUsed="1"/>
+    <w:lsdException w:name="Table List 1" w:semiHidden="1" w:unhideWhenUsed="1"/>
+    <w:lsdException w:name="Table List 2" w:semiHidden="1" w:unhideWhenUsed="1"/>
+    <w:lsdException w:name="Table List 3" w:semiHidden="1" w:unhideWhenUsed="1"/>
+    <w:lsdException w:name="Table List 4" w:semiHidden="1" w:unhideWhenUsed="1"/>
+    <w:lsdException w:name="Table List 5" w:semiHidden="1" w:unhideWhenUsed="1"/>
+    <w:lsdException w:name="Table List 6" w:semiHidden="1" w:unhideWhenUsed="1"/>
+    <w:lsdException w:name="Table List 7" w:semiHidden="1" w:unhideWhenUsed="1"/>
+    <w:lsdException w:name="Table List 8" w:semiHidden="1" w:unhideWhenUsed="1"/>
+    <w:lsdException w:name="Table 3D effects 1" w:semiHidden="1" w:unhideWhenUsed="1"/>
+    <w:lsdException w:name="Table 3D effects 2" w:semiHidden="1" w:unhideWhenUsed="1"/>
+    <w:lsdException w:name="Table 3D effects 3" w:semiHidden="1" w:unhideWhenUsed="1"/>
+    <w:lsdException w:name="Table Contemporary" w:semiHidden="1" w:unhideWhenUsed="1"/>
+    <w:lsdException w:name="Table Elegant" w:semiHidden="1" w:unhideWhenUsed="1"/>
+    <w:lsdException w:name="Table Professional" w:semiHidden="1" w:unhideWhenUsed="1"/>
+    <w:lsdException w:name="Table Subtle 1" w:semiHidden="1" w:unhideWhenUsed="1"/>
+    <w:lsdException w:name="Table Subtle 2" w:semiHidden="1" w:unhideWhenUsed="1"/>
+    <w:lsdException w:name="Table Web 1" w:semiHidden="1" w:unhideWhenUsed="1"/>
+    <w:lsdException w:name="Table Web 2" w:semiHidden="1" w:unhideWhenUsed="1"/>
+    <w:lsdException w:name="Table Web 3" w:semiHidden="1" w:unhideWhenUsed="1"/>
+    <w:lsdException w:name="Balloon Text" w:semiHidden="1" w:unhideWhenUsed="1"/>
+    <w:lsdException w:name="Table Grid" w:uiPriority="39"/>
+    <w:lsdException w:name="Table Theme" w:semiHidden="1" w:unhideWhenUsed="1"/>
+    <w:lsdException w:name="Placeholder Text" w:semiHidden="1"/>
+    <w:lsdException w:name="No Spacing" w:uiPriority="1" w:qFormat="1"/>
+    <w:lsdException w:name="Light Shading" w:uiPriority="60"/>
+    <w:lsdException w:name="Light List" w:uiPriority="61"/>
+    <w:lsdException w:name="Light Grid" w:uiPriority="62"/>
+    <w:lsdException w:name="Medium Shading 1" w:uiPriority="63"/>
+    <w:lsdException w:name="Medium Shading 2" w:uiPriority="64"/>
+    <w:lsdException w:name="Medium List 1" w:uiPriority="65"/>
+    <w:lsdException w:name="Medium List 2" w:uiPriority="66"/>
+    <w:lsdException w:name="Medium Grid 1" w:uiPriority="67"/>
+    <w:lsdException w:name="Medium Grid 2" w:uiPriority="68"/>
+    <w:lsdException w:name="Medium Grid 3" w:uiPriority="69"/>
+    <w:lsdException w:name="Dark List" w:uiPriority="70"/>
+    <w:lsdException w:name="Colorful Shading" w:uiPriority="71"/>
+    <w:lsdException w:name="Colorful List" w:uiPriority="72"/>
+    <w:lsdException w:name="Colorful Grid" w:uiPriority="73"/>
+    <w:lsdException w:name="Light Shading Accent 1" w:uiPriority="60"/>
+    <w:lsdException w:name="Light List Accent 1" w:uiPriority="61"/>
+    <w:lsdException w:name="Light Grid Accent 1" w:uiPriority="62"/>
+    <w:lsdException w:name="Medium Shading 1 Accent 1" w:uiPriority="63"/>
+    <w:lsdException w:name="Medium Shading 2 Accent 1" w:uiPriority="64"/>
+    <w:lsdException w:name="Medium List 1 Accent 1" w:uiPriority="65"/>
+    <w:lsdException w:name="Revision" w:semiHidden="1"/>
+    <w:lsdException w:name="List Paragraph" w:uiPriority="34" w:qFormat="1"/>
+    <w:lsdException w:name="Quote" w:uiPriority="29" w:qFormat="1"/>
+    <w:lsdException w:name="Intense Quote" w:uiPriority="30" w:qFormat="1"/>
+    <w:lsdException w:name="Medium List 2 Accent 1" w:uiPriority="66"/>
+    <w:lsdException w:name="Medium Grid 1 Accent 1" w:uiPriority="67"/>
+    <w:lsdException w:name="Medium Grid 2 Accent 1" w:uiPriority="68"/>
+    <w:lsdException w:name="Medium Grid 3 Accent 1" w:uiPriority="69"/>
+    <w:lsdException w:name="Dark List Accent 1" w:uiPriority="70"/>
+    <w:lsdException w:name="Colorful Shading Accent 1" w:uiPriority="71"/>
+    <w:lsdException w:name="Colorful List Accent 1" w:uiPriority="72"/>
+    <w:lsdException w:name="Colorful Grid Accent 1" w:uiPriority="73"/>
+    <w:lsdException w:name="Light Shading Accent 2" w:uiPriority="60"/>
+    <w:lsdException w:name="Light List Accent 2" w:uiPriority="61"/>
+    <w:lsdException w:name="Light Grid Accent 2" w:uiPriority="62"/>
+    <w:lsdException w:name="Medium Shading 1 Accent 2" w:uiPriority="63"/>
+    <w:lsdException w:name="Medium Shading 2 Accent 2" w:uiPriority="64"/>
+    <w:lsdException w:name="Medium List 1 Accent 2" w:uiPriority="65"/>
+    <w:lsdException w:name="Medium List 2 Accent 2" w:uiPriority="66"/>
+    <w:lsdException w:name="Medium Grid 1 Accent 2" w:uiPriority="67"/>
+    <w:lsdException w:name="Medium Grid 2 Accent 2" w:uiPriority="68"/>
+    <w:lsdException w:name="Medium Grid 3 Accent 2" w:uiPriority="69"/>
+    <w:lsdException w:name="Dark List Accent 2" w:uiPriority="70"/>
+    <w:lsdException w:name="Colorful Shading Accent 2" w:uiPriority="71"/>
+    <w:lsdException w:name="Colorful List Accent 2" w:uiPriority="72"/>
+    <w:lsdException w:name="Colorful Grid Accent 2" w:uiPriority="73"/>
+    <w:lsdException w:name="Light Shading Accent 3" w:uiPriority="60"/>
+    <w:lsdException w:name="Light List Accent 3" w:uiPriority="61"/>
+    <w:lsdException w:name="Light Grid Accent 3" w:uiPriority="62"/>
+    <w:lsdException w:name="Medium Shading 1 Accent 3" w:uiPriority="63"/>
+    <w:lsdException w:name="Medium Shading 2 Accent 3" w:uiPriority="64"/>
+    <w:lsdException w:name="Medium List 1 Accent 3" w:uiPriority="65"/>
+    <w:lsdException w:name="Medium List 2 Accent 3" w:uiPriority="66"/>
+    <w:lsdException w:name="Medium Grid 1 Accent 3" w:uiPriority="67"/>
+    <w:lsdException w:name="Medium Grid 2 Accent 3" w:uiPriority="68"/>
+    <w:lsdException w:name="Medium Grid 3 Accent 3" w:uiPriority="69"/>
+    <w:lsdException w:name="Dark List Accent 3" w:uiPriority="70"/>
+    <w:lsdException w:name="Colorful Shading Accent 3" w:uiPriority="71"/>
+    <w:lsdException w:name="Colorful List Accent 3" w:uiPriority="72"/>
+    <w:lsdException w:name="Colorful Grid Accent 3" w:uiPriority="73"/>
+    <w:lsdException w:name="Light Shading Accent 4" w:uiPriority="60"/>
+    <w:lsdException w:name="Light List Accent 4" w:uiPriority="61"/>
+    <w:lsdException w:name="Light Grid Accent 4" w:uiPriority="62"/>
+    <w:lsdException w:name="Medium Shading 1 Accent 4" w:uiPriority="63"/>
+    <w:lsdException w:name="Medium Shading 2 Accent 4" w:uiPriority="64"/>
+    <w:lsdException w:name="Medium List 1 Accent 4" w:uiPriority="65"/>
+    <w:lsdException w:name="Medium List 2 Accent 4" w:uiPriority="66"/>
+    <w:lsdException w:name="Medium Grid 1 Accent 4" w:uiPriority="67"/>
+    <w:lsdException w:name="Medium Grid 2 Accent 4" w:uiPriority="68"/>
+    <w:lsdException w:name="Medium Grid 3 Accent 4" w:uiPriority="69"/>
+    <w:lsdException w:name="Dark List Accent 4" w:uiPriority="70"/>
+    <w:lsdException w:name="Colorful Shading Accent 4" w:uiPriority="71"/>
+    <w:lsdException w:name="Colorful List Accent 4" w:uiPriority="72"/>
+    <w:lsdException w:name="Colorful Grid Accent 4" w:uiPriority="73"/>
+    <w:lsdException w:name="Light Shading Accent 5" w:uiPriority="60"/>
+    <w:lsdException w:name="Light List Accent 5" w:uiPriority="61"/>
+    <w:lsdException w:name="Light Grid Accent 5" w:uiPriority="62"/>
+    <w:lsdException w:name="Medium Shading 1 Accent 5" w:uiPriority="63"/>
+    <w:lsdException w:name="Medium Shading 2 Accent 5" w:uiPriority="64"/>
+    <w:lsdException w:name="Medium List 1 Accent 5" w:uiPriority="65"/>
+    <w:lsdException w:name="Medium List 2 Accent 5" w:uiPriority="66"/>
+    <w:lsdException w:name="Medium Grid 1 Accent 5" w:uiPriority="67"/>
+    <w:lsdException w:name="Medium Grid 2 Accent 5" w:uiPriority="68"/>
+    <w:lsdException w:name="Medium Grid 3 Accent 5" w:uiPriority="69"/>
+    <w:lsdException w:name="Dark List Accent 5" w:uiPriority="70"/>
+    <w:lsdException w:name="Colorful Shading Accent 5" w:uiPriority="71"/>
+    <w:lsdException w:name="Colorful List Accent 5" w:uiPriority="72"/>
+    <w:lsdException w:name="Colorful Grid Accent 5" w:uiPriority="73"/>
+    <w:lsdException w:name="Light Shading Accent 6" w:uiPriority="60"/>
+    <w:lsdException w:name="Light List Accent 6" w:uiPriority="61"/>
+    <w:lsdException w:name="Light Grid Accent 6" w:uiPriority="62"/>
+    <w:lsdException w:name="Medium Shading 1 Accent 6" w:uiPriority="63"/>
+    <w:lsdException w:name="Medium Shading 2 Accent 6" w:uiPriority="64"/>
+    <w:lsdException w:name="Medium List 1 Accent 6" w:uiPriority="65"/>
+    <w:lsdException w:name="Medium List 2 Accent 6" w:uiPriority="66"/>
+    <w:lsdException w:name="Medium Grid 1 Accent 6" w:uiPriority="67"/>
+    <w:lsdException w:name="Medium Grid 2 Accent 6" w:uiPriority="68"/>
+    <w:lsdException w:name="Medium Grid 3 Accent 6" w:uiPriority="69"/>
+    <w:lsdException w:name="Dark List Accent 6" w:uiPriority="70"/>
+    <w:lsdException w:name="Colorful Shading Accent 6" w:uiPriority="71"/>
+    <w:lsdException w:name="Colorful List Accent 6" w:uiPriority="72"/>
+    <w:lsdException w:name="Colorful Grid Accent 6" w:uiPriority="73"/>
+    <w:lsdException w:name="Subtle Emphasis" w:uiPriority="19" w:qFormat="1"/>
+    <w:lsdException w:name="Intense Emphasis" w:uiPriority="21" w:qFormat="1"/>
+    <w:lsdException w:name="Subtle Reference" w:uiPriority="31" w:qFormat="1"/>
+    <w:lsdException w:name="Intense Reference" w:uiPriority="32" w:qFormat="1"/>
+    <w:lsdException w:name="Book Title" w:uiPriority="33" w:qFormat="1"/>
+    <w:lsdException w:name="Bibliography" w:semiHidden="1" w:uiPriority="37" w:unhideWhenUsed="1"/>
+    <w:lsdException w:name="TOC Heading" w:semiHidden="1" w:uiPriority="39" w:unhideWhenUsed="1" w:qFormat="1"/>
+    <w:lsdException w:name="Plain Table 1" w:uiPriority="41"/>
+    <w:lsdException w:name="Plain Table 2" w:uiPriority="42"/>
+    <w:lsdException w:name="Plain Table 3" w:uiPriority="43"/>
+    <w:lsdException w:name="Plain Table 4" w:uiPriority="44"/>
+    <w:lsdException w:name="Plain Table 5" w:uiPriority="45"/>
+    <w:lsdException w:name="Grid Table Light" w:uiPriority="40"/>
+    <w:lsdException w:name="Grid Table 1 Light" w:uiPriority="46"/>
+    <w:lsdException w:name="Grid Table 2" w:uiPriority="47"/>
+    <w:lsdException w:name="Grid Table 3" w:uiPriority="48"/>
+    <w:lsdException w:name="Grid Table 4" w:uiPriority="49"/>
+    <w:lsdException w:name="Grid Table 5 Dark" w:uiPriority="50"/>
+    <w:lsdException w:name="Grid Table 6 Colorful" w:uiPriority="51"/>
+    <w:lsdException w:name="Grid Table 7 Colorful" w:uiPriority="52"/>
+    <w:lsdException w:name="Grid Table 1 Light Accent 1" w:uiPriority="46"/>
+    <w:lsdException w:name="Grid Table 2 Accent 1" w:uiPriority="47"/>
+    <w:lsdException w:name="Grid Table 3 Accent 1" w:uiPriority="48"/>
+    <w:lsdException w:name="Grid Table 4 Accent 1" w:uiPriority="49"/>
+    <w:lsdException w:name="Grid Table 5 Dark Accent 1" w:uiPriority="50"/>
+    <w:lsdException w:name="Grid Table 6 Colorful Accent 1" w:uiPriority="51"/>
+    <w:lsdException w:name="Grid Table 7 Colorful Accent 1" w:uiPriority="52"/>
+    <w:lsdException w:name="Grid Table 1 Light Accent 2" w:uiPriority="46"/>
+    <w:lsdException w:name="Grid Table 2 Accent 2" w:uiPriority="47"/>
+    <w:lsdException w:name="Grid Table 3 Accent 2" w:uiPriority="48"/>
+    <w:lsdException w:name="Grid Table 4 Accent 2" w:uiPriority="49"/>
+    <w:lsdException w:name="Grid Table 5 Dark Accent 2" w:uiPriority="50"/>
+    <w:lsdException w:name="Grid Table 6 Colorful Accent 2" w:uiPriority="51"/>
+    <w:lsdException w:name="Grid Table 7 Colorful Accent 2" w:uiPriority="52"/>
+    <w:lsdException w:name="Grid Table 1 Light Accent 3" w:uiPriority="46"/>
+    <w:lsdException w:name="Grid Table 2 Accent 3" w:uiPriority="47"/>
+    <w:lsdException w:name="Grid Table 3 Accent 3" w:uiPriority="48"/>
+    <w:lsdException w:name="Grid Table 4 Accent 3" w:uiPriority="49"/>
+    <w:lsdException w:name="Grid Table 5 Dark Accent 3" w:uiPriority="50"/>
+    <w:lsdException w:name="Grid Table 6 Colorful Accent 3" w:uiPriority="51"/>
+    <w:lsdException w:name="Grid Table 7 Colorful Accent 3" w:uiPriority="52"/>
+    <w:lsdException w:name="Grid Table 1 Light Accent 4" w:uiPriority="46"/>
+    <w:lsdException w:name="Grid Table 2 Accent 4" w:uiPriority="47"/>
+    <w:lsdException w:name="Grid Table 3 Accent 4" w:uiPriority="48"/>
+    <w:lsdException w:name="Grid Table 4 Accent 4" w:uiPriority="49"/>
+    <w:lsdException w:name="Grid Table 5 Dark Accent 4" w:uiPriority="50"/>
+    <w:lsdException w:name="Grid Table 6 Colorful Accent 4" w:uiPriority="51"/>
+    <w:lsdException w:name="Grid Table 7 Colorful Accent 4" w:uiPriority="52"/>
+    <w:lsdException w:name="Grid Table 1 Light Accent 5" w:uiPriority="46"/>
+    <w:lsdException w:name="Grid Table 2 Accent 5" w:uiPriority="47"/>
+    <w:lsdException w:name="Grid Table 3 Accent 5" w:uiPriority="48"/>
+    <w:lsdException w:name="Grid Table 4 Accent 5" w:uiPriority="49"/>
+    <w:lsdException w:name="Grid Table 5 Dark Accent 5" w:uiPriority="50"/>
+    <w:lsdException w:name="Grid Table 6 Colorful Accent 5" w:uiPriority="51"/>
+    <w:lsdException w:name="Grid Table 7 Colorful Accent 5" w:uiPriority="52"/>
+    <w:lsdException w:name="Grid Table 1 Light Accent 6" w:uiPriority="46"/>
+    <w:lsdException w:name="Grid Table 2 Accent 6" w:uiPriority="47"/>
+    <w:lsdException w:name="Grid Table 3 Accent 6" w:uiPriority="48"/>
+    <w:lsdException w:name="Grid Table 4 Accent 6" w:uiPriority="49"/>
+    <w:lsdException w:name="Grid Table 5 Dark Accent 6" w:uiPriority="50"/>
+    <w:lsdException w:name="Grid Table 6 Colorful Accent 6" w:uiPriority="51"/>
+    <w:lsdException w:name="Grid Table 7 Colorful Accent 6" w:uiPriority="52"/>
+    <w:lsdException w:name="List Table 1 Light" w:uiPriority="46"/>
+    <w:lsdException w:name="List Table 2" w:uiPriority="47"/>
+    <w:lsdException w:name="List Table 3" w:uiPriority="48"/>
+    <w:lsdException w:name="List Table 4" w:uiPriority="49"/>
+    <w:lsdException w:name="List Table 5 Dark" w:uiPriority="50"/>
+    <w:lsdException w:name="List Table 6 Colorful" w:uiPriority="51"/>
+    <w:lsdException w:name="List Table 7 Colorful" w:uiPriority="52"/>
+    <w:lsdException w:name="List Table 1 Light Accent 1" w:uiPriority="46"/>
+    <w:lsdException w:name="List Table 2 Accent 1" w:uiPriority="47"/>
+    <w:lsdException w:name="List Table 3 Accent 1" w:uiPriority="48"/>
+    <w:lsdException w:name="List Table 4 Accent 1" w:uiPriority="49"/>
+    <w:lsdException w:name="List Table 5 Dark Accent 1" w:uiPriority="50"/>
+    <w:lsdException w:name="List Table 6 Colorful Accent 1" w:uiPriority="51"/>
+    <w:lsdException w:name="List Table 7 Colorful Accent 1" w:uiPriority="52"/>
+    <w:lsdException w:name="List Table 1 Light Accent 2" w:uiPriority="46"/>
+    <w:lsdException w:name="List Table 2 Accent 2" w:uiPriority="47"/>
+    <w:lsdException w:name="List Table 3 Accent 2" w:uiPriority="48"/>
+    <w:lsdException w:name="List Table 4 Accent 2" w:uiPriority="49"/>
+    <w:lsdException w:name="List Table 5 Dark Accent 2" w:uiPriority="50"/>
+    <w:lsdException w:name="List Table 6 Colorful Accent 2" w:uiPriority="51"/>
+    <w:lsdException w:name="List Table 7 Colorful Accent 2" w:uiPriority="52"/>
+    <w:lsdException w:name="List Table 1 Light Accent 3" w:uiPriority="46"/>
+    <w:lsdException w:name="List Table 2 Accent 3" w:uiPriority="47"/>
+    <w:lsdException w:name="List Table 3 Accent 3" w:uiPriority="48"/>
+    <w:lsdException w:name="List Table 4 Accent 3" w:uiPriority="49"/>
+    <w:lsdException w:name="List Table 5 Dark Accent 3" w:uiPriority="50"/>
+    <w:lsdException w:name="List Table 6 Colorful Accent 3" w:uiPriority="51"/>
+    <w:lsdException w:name="List Table 7 Colorful Accent 3" w:uiPriority="52"/>
+    <w:lsdException w:name="List Table 1 Light Accent 4" w:uiPriority="46"/>
+    <w:lsdException w:name="List Table 2 Accent 4" w:uiPriority="47"/>
+    <w:lsdException w:name="List Table 3 Accent 4" w:uiPriority="48"/>
+    <w:lsdException w:name="List Table 4 Accent 4" w:uiPriority="49"/>
+    <w:lsdException w:name="List Table 5 Dark Accent 4" w:uiPriority="50"/>
+    <w:lsdException w:name="List Table 6 Colorful Accent 4" w:uiPriority="51"/>
+    <w:lsdException w:name="List Table 7 Colorful Accent 4" w:uiPriority="52"/>
+    <w:lsdException w:name="List Table 1 Light Accent 5" w:uiPriority="46"/>
+    <w:lsdException w:name="List Table 2 Accent 5" w:uiPriority="47"/>
+    <w:lsdException w:name="List Table 3 Accent 5" w:uiPriority="48"/>
+    <w:lsdException w:name="List Table 4 Accent 5" w:uiPriority="49"/>
+    <w:lsdException w:name="List Table 5 Dark Accent 5" w:uiPriority="50"/>
+    <w:lsdException w:name="List Table 6 Colorful Accent 5" w:uiPriority="51"/>
+    <w:lsdException w:name="List Table 7 Colorful Accent 5" w:uiPriority="52"/>
+    <w:lsdException w:name="List Table 1 Light Accent 6" w:uiPriority="46"/>
+    <w:lsdException w:name="List Table 2 Accent 6" w:uiPriority="47"/>
+    <w:lsdException w:name="List Table 3 Accent 6" w:uiPriority="48"/>
+    <w:lsdException w:name="List Table 4 Accent 6" w:uiPriority="49"/>
+    <w:lsdException w:name="List Table 5 Dark Accent 6" w:uiPriority="50"/>
+    <w:lsdException w:name="List Table 6 Colorful Accent 6" w:uiPriority="51"/>
+    <w:lsdException w:name="List Table 7 Colorful Accent 6" w:uiPriority="52"/>
+    <w:lsdException w:name="Mention" w:semiHidden="1" w:unhideWhenUsed="1"/>
+    <w:lsdException w:name="Smart Hyperlink" w:semiHidden="1" w:unhideWhenUsed="1"/>
+    <w:lsdException w:name="Hashtag" w:semiHidden="1" w:unhideWhenUsed="1"/>
+    <w:lsdException w:name="Unresolved Mention" w:semiHidden="1" w:unhideWhenUsed="1"/>
+    <w:lsdException w:name="Smart Link" w:semiHidden="1" w:unhideWhenUsed="1"/>
+  </w:latentStyles>
   <w:style w:type="paragraph" w:default="1" w:styleId="Normal">
     <w:name w:val="Normal"/>
     <w:qFormat/>
   </w:style>
-  <w:style w:type="paragraph" w:styleId="BodyText">
-    <w:name w:val="Body Text"/>
-    <w:basedOn w:val="Normal"/>
-    <w:link w:val="BodyTextChar"/>
-    <w:pPr>
-      <w:spacing w:before="180" w:after="180"/>
-    </w:pPr>
-    <w:qFormat/>
-  </w:style>
-  <w:style w:type="paragraph" w:customStyle="1" w:styleId="FirstParagraph">
-    <w:name w:val="First Paragraph"/>
-    <w:basedOn w:val="BodyText"/>
-    <w:next w:val="BodyText"/>
-    <w:qFormat/>
-  </w:style>
-  <w:style w:type="paragraph" w:customStyle="1" w:styleId="Compact">
-    <w:name w:val="Compact"/>
-    <w:basedOn w:val="BodyText"/>
-    <w:qFormat/>
-    <w:pPr>
-      <w:spacing w:before="36" w:after="36"/>
-    </w:pPr>
-  </w:style>
-  <w:style w:type="paragraph" w:styleId="Title">
-    <w:name w:val="Title"/>
-    <w:basedOn w:val="Normal"/>
-    <w:next w:val="BodyText"/>
-    <w:qFormat/>
-    <w:pPr>
-      <w:keepNext/>
-      <w:keepLines/>
-      <w:spacing w:before="480" w:after="240"/>
-      <w:jc w:val="center"/>
-    </w:pPr>
-    <w:rPr>
-      <w:rFonts w:asciiTheme="majorHAnsi" w:eastAsiaTheme="majorEastAsia" w:hAnsiTheme="majorHAnsi" w:cstheme="majorBidi"/>
-      <w:b/>
-      <w:bCs/>
-      <w:color w:val="345A8A" w:themeColor="accent1" w:themeShade="B5"/>
-      <w:sz w:val="36"/>
-      <w:szCs w:val="36"/>
-    </w:rPr>
-  </w:style>
-  <w:style w:type="paragraph" w:styleId="Subtitle">
-    <w:name w:val="Subtitle"/>
-    <w:basedOn w:val="Title"/>
-    <w:next w:val="BodyText"/>
-    <w:qFormat/>
-    <w:pPr>
-      <w:keepNext/>
-      <w:keepLines/>
-      <w:spacing w:before="240" w:after="240"/>
-      <w:jc w:val="center"/>
-    </w:pPr>
-    <w:rPr>
-      <w:sz w:val="30"/>
-      <w:szCs w:val="30"/>
-    </w:rPr>
-  </w:style>
-  <w:style w:type="paragraph" w:customStyle="1" w:styleId="Author">
-    <w:name w:val="Author"/>
-    <w:next w:val="BodyText"/>
-    <w:qFormat/>
-    <w:pPr>
-      <w:keepNext/>
-      <w:keepLines/>
-      <w:jc w:val="center"/>
-    </w:pPr>
-  </w:style>
-  <w:style w:type="paragraph" w:styleId="Date">
-    <w:name w:val="Date"/>
-    <w:next w:val="BodyText"/>
-    <w:qFormat/>
-    <w:pPr>
-      <w:keepNext/>
-      <w:keepLines/>
-      <w:jc w:val="center"/>
-    </w:pPr>
-  </w:style>
-  <w:style w:type="paragraph" w:customStyle="1" w:styleId="Abstract">
-    <w:name w:val="Abstract"/>
-    <w:basedOn w:val="Normal"/>
-    <w:next w:val="BodyText"/>
-    <w:qFormat/>
-    <w:pPr>
-      <w:keepNext/>
-      <w:keepLines/>
-      <w:spacing w:before="300" w:after="300"/>
-    </w:pPr>
-    <w:rPr>
-      <w:sz w:val="20"/>
-      <w:szCs w:val="20"/>
-    </w:rPr>
-  </w:style>
-  <w:style w:type="paragraph" w:styleId="Bibliography">
-    <w:name w:val="Bibliography"/>
-    <w:basedOn w:val="Normal"/>
-    <w:next w:val="Bibliography"/>
-    <w:qFormat/>
-    <w:pPr/>
-    <w:rPr/>
-  </w:style>
   <w:style w:type="paragraph" w:styleId="Heading1">
-    <w:name w:val="Heading 1"/>
-    <w:basedOn w:val="Normal"/>
-    <w:next w:val="BodyText"/>
+    <w:name w:val="heading 1"/>
     <w:uiPriority w:val="9"/>
     <w:qFormat/>
     <w:pPr>
-      <w:keepNext/>
-      <w:keepLines/>
-      <w:spacing w:before="480" w:after="0"/>
+      <w:spacing w:before="480" w:after="240"/>
       <w:outlineLvl w:val="0"/>
     </w:pPr>
     <w:rPr>
-      <w:rFonts w:asciiTheme="majorHAnsi" w:eastAsiaTheme="majorEastAsia" w:hAnsiTheme="majorHAnsi" w:cstheme="majorBidi"/>
       <w:b/>
       <w:bCs/>
-      <w:color w:val="4F81BD" w:themeColor="accent1"/>
+      <w:color w:val="1F4E79"/>
       <w:sz w:val="32"/>
       <w:szCs w:val="32"/>
     </w:rPr>
   </w:style>
   <w:style w:type="paragraph" w:styleId="Heading2">
-    <w:name w:val="Heading 2"/>
-    <w:basedOn w:val="Normal"/>
-    <w:next w:val="BodyText"/>
+    <w:name w:val="heading 2"/>
     <w:uiPriority w:val="9"/>
     <w:unhideWhenUsed/>
     <w:qFormat/>
     <w:pPr>
-      <w:keepNext/>
-      <w:keepLines/>
-      <w:spacing w:before="200" w:after="0"/>
+      <w:spacing w:before="360" w:after="180"/>
       <w:outlineLvl w:val="1"/>
     </w:pPr>
     <w:rPr>
-      <w:rFonts w:asciiTheme="majorHAnsi" w:eastAsiaTheme="majorEastAsia" w:hAnsiTheme="majorHAnsi" w:cstheme="majorBidi"/>
       <w:b/>
       <w:bCs/>
-      <w:color w:val="4F81BD" w:themeColor="accent1"/>
-      <w:sz w:val="28"/>
-      <w:szCs w:val="28"/>
+      <w:color w:val="2E74B5"/>
+      <w:sz w:val="26"/>
+      <w:szCs w:val="26"/>
     </w:rPr>
   </w:style>
   <w:style w:type="paragraph" w:styleId="Heading3">
-    <w:name w:val="Heading 3"/>
-    <w:basedOn w:val="Normal"/>
-    <w:next w:val="BodyText"/>
+    <w:name w:val="heading 3"/>
     <w:uiPriority w:val="9"/>
+    <w:semiHidden/>
     <w:unhideWhenUsed/>
     <w:qFormat/>
     <w:pPr>
-      <w:keepNext/>
-      <w:keepLines/>
-      <w:spacing w:before="200" w:after="0"/>
+      <w:spacing w:before="240" w:after="120"/>
       <w:outlineLvl w:val="2"/>
     </w:pPr>
     <w:rPr>
-      <w:rFonts w:asciiTheme="majorHAnsi" w:eastAsiaTheme="majorEastAsia" w:hAnsiTheme="majorHAnsi" w:cstheme="majorBidi"/>
       <w:b/>
       <w:bCs/>
-      <w:color w:val="4F81BD" w:themeColor="accent1"/>
-      <w:sz w:val="24"/>
-      <w:szCs w:val="24"/>
+      <w:color w:val="1F4E79"/>
+      <w:sz w:val="23"/>
+      <w:szCs w:val="23"/>
     </w:rPr>
   </w:style>
   <w:style w:type="paragraph" w:styleId="Heading4">
-    <w:name w:val="Heading 4"/>
-    <w:basedOn w:val="Normal"/>
-    <w:next w:val="BodyText"/>
+    <w:name w:val="heading 4"/>
     <w:uiPriority w:val="9"/>
+    <w:semiHidden/>
     <w:unhideWhenUsed/>
     <w:qFormat/>
     <w:pPr>
-      <w:keepNext/>
-      <w:keepLines/>
-      <w:spacing w:before="200" w:after="0"/>
       <w:outlineLvl w:val="3"/>
     </w:pPr>
     <w:rPr>
-      <w:rFonts w:asciiTheme="majorHAnsi" w:eastAsiaTheme="majorEastAsia" w:hAnsiTheme="majorHAnsi" w:cstheme="majorBidi"/>
       <w:i/>
-      <w:bCs/>
-      <w:color w:val="4F81BD" w:themeColor="accent1"/>
-      <w:sz w:val="24"/>
-      <w:szCs w:val="24"/>
+      <w:iCs/>
+      <w:color w:val="2E74B5"/>
     </w:rPr>
   </w:style>
   <w:style w:type="paragraph" w:styleId="Heading5">
-    <w:name w:val="Heading 5"/>
-    <w:basedOn w:val="Normal"/>
-    <w:next w:val="BodyText"/>
+    <w:name w:val="heading 5"/>
     <w:uiPriority w:val="9"/>
+    <w:semiHidden/>
     <w:unhideWhenUsed/>
     <w:qFormat/>
     <w:pPr>
-      <w:keepNext/>
-      <w:keepLines/>
-      <w:spacing w:before="200" w:after="0"/>
       <w:outlineLvl w:val="4"/>
     </w:pPr>
     <w:rPr>
-      <w:rFonts w:asciiTheme="majorHAnsi" w:eastAsiaTheme="majorEastAsia" w:hAnsiTheme="majorHAnsi" w:cstheme="majorBidi"/>
-      <w:iCs/>
-      <w:color w:val="4F81BD" w:themeColor="accent1"/>
-      <w:sz w:val="24"/>
-      <w:szCs w:val="24"/>
+      <w:color w:val="2E74B5"/>
     </w:rPr>
   </w:style>
   <w:style w:type="paragraph" w:styleId="Heading6">
-    <w:name w:val="Heading 6"/>
-    <w:basedOn w:val="Normal"/>
-    <w:next w:val="BodyText"/>
+    <w:name w:val="heading 6"/>
     <w:uiPriority w:val="9"/>
+    <w:semiHidden/>
     <w:unhideWhenUsed/>
     <w:qFormat/>
     <w:pPr>
-      <w:keepNext/>
-      <w:keepLines/>
-      <w:spacing w:before="200" w:after="0"/>
       <w:outlineLvl w:val="5"/>
     </w:pPr>
     <w:rPr>
-      <w:rFonts w:asciiTheme="majorHAnsi" w:eastAsiaTheme="majorEastAsia" w:hAnsiTheme="majorHAnsi" w:cstheme="majorBidi"/>
-      <w:color w:val="4F81BD" w:themeColor="accent1"/>
-      <w:sz w:val="24"/>
-      <w:szCs w:val="24"/>
+      <w:color w:val="1F4D78"/>
     </w:rPr>
-  </w:style>
-  <w:style w:type="paragraph" w:styleId="Heading7">
-    <w:name w:val="Heading 7"/>
-    <w:basedOn w:val="Normal"/>
-    <w:next w:val="BodyText"/>
-    <w:uiPriority w:val="9"/>
-    <w:unhideWhenUsed/>
-    <w:qFormat/>
-    <w:pPr>
-      <w:keepNext/>
-      <w:keepLines/>
-      <w:spacing w:before="200" w:after="0"/>
-      <w:outlineLvl w:val="6"/>
-    </w:pPr>
-    <w:rPr>
-      <w:rFonts w:asciiTheme="majorHAnsi" w:eastAsiaTheme="majorEastAsia" w:hAnsiTheme="majorHAnsi" w:cstheme="majorBidi"/>
-      <w:color w:val="4F81BD" w:themeColor="accent1"/>
-      <w:sz w:val="24"/>
-      <w:szCs w:val="24"/>
-    </w:rPr>
-  </w:style>
-  <w:style w:type="paragraph" w:styleId="Heading8">
-    <w:name w:val="Heading 8"/>
-    <w:basedOn w:val="Normal"/>
-    <w:next w:val="BodyText"/>
-    <w:uiPriority w:val="9"/>
-    <w:unhideWhenUsed/>
-    <w:qFormat/>
-    <w:pPr>
-      <w:keepNext/>
-      <w:keepLines/>
-      <w:spacing w:before="200" w:after="0"/>
-      <w:outlineLvl w:val="7"/>
-    </w:pPr>
-    <w:rPr>
-      <w:rFonts w:asciiTheme="majorHAnsi" w:eastAsiaTheme="majorEastAsia" w:hAnsiTheme="majorHAnsi" w:cstheme="majorBidi"/>
-      <w:color w:val="4F81BD" w:themeColor="accent1"/>
-      <w:sz w:val="24"/>
-      <w:szCs w:val="24"/>
-    </w:rPr>
-  </w:style>
-  <w:style w:type="paragraph" w:styleId="Heading9">
-    <w:name w:val="Heading 9"/>
-    <w:basedOn w:val="Normal"/>
-    <w:next w:val="BodyText"/>
-    <w:uiPriority w:val="9"/>
-    <w:unhideWhenUsed/>
-    <w:qFormat/>
-    <w:pPr>
-      <w:keepNext/>
-      <w:keepLines/>
-      <w:spacing w:before="200" w:after="0"/>
-      <w:outlineLvl w:val="8"/>
-    </w:pPr>
-    <w:rPr>
-      <w:rFonts w:asciiTheme="majorHAnsi" w:eastAsiaTheme="majorEastAsia" w:hAnsiTheme="majorHAnsi" w:cstheme="majorBidi"/>
-      <w:color w:val="4F81BD" w:themeColor="accent1"/>
-      <w:sz w:val="24"/>
-      <w:szCs w:val="24"/>
-    </w:rPr>
-  </w:style>
-  <w:style w:type="paragraph" w:styleId="BlockText">
-    <w:name w:val="Block Text"/>
-    <w:basedOn w:val="BodyText"/>
-    <w:next w:val="BodyText"/>
-    <w:uiPriority w:val="9"/>
-    <w:unhideWhenUsed/>
-    <w:qFormat/>
-    <w:pPr>
-      <w:spacing w:before="100" w:after="100"/>
-      <w:ind w:firstLine="0" w:left="480" w:right="480"/>
-    </w:pPr>
-  </w:style>
-  <w:style w:type="paragraph" w:styleId="FootnoteText">
-    <w:name w:val="Footnote Text"/>
-    <w:basedOn w:val="Normal"/>
-    <w:next w:val="FootnoteText"/>
-    <w:uiPriority w:val="9"/>
-    <w:unhideWhenUsed/>
-    <w:qFormat/>
   </w:style>
   <w:style w:type="character" w:default="1" w:styleId="DefaultParagraphFont">
     <w:name w:val="Default Paragraph Font"/>
+    <w:uiPriority w:val="1"/>
+    <w:unhideWhenUsed/>
+  </w:style>
+  <w:style w:type="table" w:default="1" w:styleId="TableNormal">
+    <w:name w:val="Normal Table"/>
+    <w:uiPriority w:val="99"/>
     <w:semiHidden/>
     <w:unhideWhenUsed/>
-  </w:style>
-  <w:style w:type="table" w:default="1" w:styleId="Table">
-    <w:name w:val="Table"/>
-    <w:basedOn w:val="TableNormal"/>
-    <w:semiHidden/>
-    <w:unhideWhenUsed/>
-    <w:qFormat/>
     <w:tblPr>
       <w:tblInd w:w="0" w:type="dxa"/>
       <w:tblCellMar>
@@ -8488,99 +8896,220 @@
       </w:tblCellMar>
     </w:tblPr>
   </w:style>
-  <w:style w:type="paragraph" w:customStyle="1" w:styleId="DefinitionTerm">
-    <w:name w:val="Definition Term"/>
-    <w:basedOn w:val="Normal"/>
-    <w:next w:val="Definition"/>
-    <w:pPr>
-      <w:keepNext/>
-      <w:keepLines/>
-      <w:spacing w:after="0"/>
-    </w:pPr>
+  <w:style w:type="numbering" w:default="1" w:styleId="NoList">
+    <w:name w:val="No List"/>
+    <w:uiPriority w:val="99"/>
+    <w:semiHidden/>
+    <w:unhideWhenUsed/>
+  </w:style>
+  <w:style w:type="paragraph" w:styleId="Title">
+    <w:name w:val="Title"/>
+    <w:uiPriority w:val="10"/>
+    <w:qFormat/>
+    <w:rPr>
+      <w:sz w:val="56"/>
+      <w:szCs w:val="56"/>
+    </w:rPr>
+  </w:style>
+  <w:style w:type="paragraph" w:customStyle="1" w:styleId="Strong1">
+    <w:name w:val="Strong1"/>
+    <w:qFormat/>
     <w:rPr>
       <w:b/>
+      <w:bCs/>
     </w:rPr>
   </w:style>
-  <w:style w:type="paragraph" w:customStyle="1" w:styleId="Definition">
-    <w:name w:val="Definition"/>
-    <w:basedOn w:val="Normal"/>
+  <w:style w:type="paragraph" w:styleId="ListParagraph">
+    <w:name w:val="List Paragraph"/>
+    <w:qFormat/>
   </w:style>
-  <w:style w:type="paragraph" w:styleId="Caption">
-    <w:name w:val="Caption"/>
-    <w:basedOn w:val="Normal"/>
-    <w:link w:val="BodyTextChar"/>
-    <w:pPr>
-      <w:spacing w:before="0" w:after="120"/>
-    </w:pPr>
+  <w:style w:type="character" w:styleId="Hyperlink">
+    <w:name w:val="Hyperlink"/>
+    <w:uiPriority w:val="99"/>
+    <w:unhideWhenUsed/>
     <w:rPr>
-      <w:i/>
-    </w:rPr>
-  </w:style>
-  <w:style w:type="paragraph" w:customStyle="1" w:styleId="TableCaption">
-    <w:name w:val="Table Caption"/>
-    <w:basedOn w:val="Caption"/>
-    <w:pPr>
-      <w:keepNext/>
-    </w:pPr>
-  </w:style>
-  <w:style w:type="paragraph" w:customStyle="1" w:styleId="ImageCaption">
-    <w:name w:val="Image Caption"/>
-    <w:basedOn w:val="Caption"/>
-  </w:style>
-  <w:style w:type="paragraph" w:customStyle="1" w:styleId="Figure">
-    <w:name w:val="Figure"/>
-    <w:basedOn w:val="Normal"/>
-  </w:style>
-  <w:style w:type="paragraph" w:customStyle="1" w:styleId="CaptionedFigure">
-    <w:name w:val="Captioned Figure"/>
-    <w:basedOn w:val="Figure"/>
-    <w:pPr>
-      <w:keepNext/>
-    </w:pPr>
-  </w:style>
-  <w:style w:type="character" w:customStyle="1" w:styleId="BodyTextChar">
-    <w:name w:val="Body Text Char"/>
-    <w:basedOn w:val="DefaultParagraphFont"/>
-    <w:link w:val="BodyText"/>
-  </w:style>
-  <w:style w:type="character" w:customStyle="1" w:styleId="VerbatimChar">
-    <w:name w:val="Verbatim Char"/>
-    <w:basedOn w:val="BodyTextChar"/>
-    <w:rPr>
-      <w:rFonts w:ascii="Consolas" w:hAnsi="Consolas"/>
-      <w:sz w:val="22"/>
+      <w:color w:val="0563C1"/>
+      <w:u w:val="single"/>
     </w:rPr>
   </w:style>
   <w:style w:type="character" w:styleId="FootnoteReference">
-    <w:name w:val="Footnote Reference"/>
-    <w:basedOn w:val="BodyTextChar"/>
+    <w:name w:val="footnote reference"/>
+    <w:uiPriority w:val="99"/>
+    <w:semiHidden/>
+    <w:unhideWhenUsed/>
     <w:rPr>
       <w:vertAlign w:val="superscript"/>
     </w:rPr>
   </w:style>
-  <w:style w:type="character" w:styleId="Hyperlink">
-    <w:name w:val="Hyperlink"/>
-    <w:basedOn w:val="BodyTextChar"/>
+  <w:style w:type="paragraph" w:styleId="FootnoteText">
+    <w:name w:val="footnote text"/>
+    <w:link w:val="FootnoteTextChar"/>
+    <w:uiPriority w:val="99"/>
+    <w:semiHidden/>
+    <w:unhideWhenUsed/>
     <w:rPr>
-      <w:color w:val="4F81BD" w:themeColor="accent1"/>
+      <w:sz w:val="20"/>
+      <w:szCs w:val="20"/>
     </w:rPr>
   </w:style>
-  <w:style w:type="paragraph" w:styleId="TOCHeading">
-    <w:name w:val="TOC Heading"/>
-    <w:basedOn w:val="Heading1"/>
-    <w:next w:val="BodyText"/>
+  <w:style w:type="character" w:customStyle="1" w:styleId="FootnoteTextChar">
+    <w:name w:val="Footnote Text Char"/>
+    <w:link w:val="FootnoteText"/>
+    <w:uiPriority w:val="99"/>
+    <w:semiHidden/>
+    <w:unhideWhenUsed/>
+    <w:rPr>
+      <w:sz w:val="20"/>
+      <w:szCs w:val="20"/>
+    </w:rPr>
+  </w:style>
+  <w:style w:type="character" w:styleId="EndnoteReference">
+    <w:name w:val="endnote reference"/>
+    <w:uiPriority w:val="99"/>
+    <w:semiHidden/>
+    <w:unhideWhenUsed/>
+    <w:rPr>
+      <w:vertAlign w:val="superscript"/>
+    </w:rPr>
+  </w:style>
+  <w:style w:type="paragraph" w:styleId="EndnoteText">
+    <w:name w:val="endnote text"/>
+    <w:link w:val="EndnoteTextChar"/>
+    <w:uiPriority w:val="99"/>
+    <w:semiHidden/>
+    <w:unhideWhenUsed/>
+    <w:rPr>
+      <w:sz w:val="20"/>
+      <w:szCs w:val="20"/>
+    </w:rPr>
+  </w:style>
+  <w:style w:type="character" w:customStyle="1" w:styleId="EndnoteTextChar">
+    <w:name w:val="Endnote Text Char"/>
+    <w:link w:val="EndnoteText"/>
+    <w:uiPriority w:val="99"/>
+    <w:semiHidden/>
+    <w:unhideWhenUsed/>
+    <w:rPr>
+      <w:sz w:val="20"/>
+      <w:szCs w:val="20"/>
+    </w:rPr>
+  </w:style>
+  <w:style w:type="paragraph" w:styleId="TOC1">
+    <w:name w:val="toc 1"/>
+    <w:basedOn w:val="Normal"/>
+    <w:next w:val="Normal"/>
+    <w:autoRedefine/>
     <w:uiPriority w:val="39"/>
     <w:unhideWhenUsed/>
+    <w:rsid w:val="00FB674B"/>
+    <w:pPr>
+      <w:spacing w:after="100"/>
+    </w:pPr>
+  </w:style>
+  <w:style w:type="paragraph" w:styleId="TOC2">
+    <w:name w:val="toc 2"/>
+    <w:basedOn w:val="Normal"/>
+    <w:next w:val="Normal"/>
+    <w:autoRedefine/>
+    <w:uiPriority w:val="39"/>
+    <w:unhideWhenUsed/>
+    <w:rsid w:val="00FB674B"/>
+    <w:pPr>
+      <w:spacing w:after="100"/>
+      <w:ind w:left="220"/>
+    </w:pPr>
+  </w:style>
+  <w:style w:type="character" w:styleId="FollowedHyperlink">
+    <w:name w:val="FollowedHyperlink"/>
+    <w:basedOn w:val="DefaultParagraphFont"/>
+    <w:uiPriority w:val="99"/>
+    <w:semiHidden/>
+    <w:unhideWhenUsed/>
+    <w:rsid w:val="00FB674B"/>
+    <w:rPr>
+      <w:color w:val="96607D" w:themeColor="followedHyperlink"/>
+      <w:u w:val="single"/>
+    </w:rPr>
+  </w:style>
+  <w:style w:type="paragraph" w:styleId="Header">
+    <w:name w:val="header"/>
+    <w:basedOn w:val="Normal"/>
+    <w:link w:val="HeaderChar"/>
+    <w:uiPriority w:val="99"/>
+    <w:unhideWhenUsed/>
+    <w:rsid w:val="00FB674B"/>
+    <w:pPr>
+      <w:tabs>
+        <w:tab w:val="center" w:pos="4680"/>
+        <w:tab w:val="right" w:pos="9360"/>
+      </w:tabs>
+    </w:pPr>
+  </w:style>
+  <w:style w:type="character" w:customStyle="1" w:styleId="HeaderChar">
+    <w:name w:val="Header Char"/>
+    <w:basedOn w:val="DefaultParagraphFont"/>
+    <w:link w:val="Header"/>
+    <w:uiPriority w:val="99"/>
+    <w:rsid w:val="00FB674B"/>
+  </w:style>
+  <w:style w:type="paragraph" w:styleId="Footer">
+    <w:name w:val="footer"/>
+    <w:basedOn w:val="Normal"/>
+    <w:link w:val="FooterChar"/>
+    <w:uiPriority w:val="99"/>
+    <w:unhideWhenUsed/>
+    <w:rsid w:val="00FB674B"/>
+    <w:pPr>
+      <w:tabs>
+        <w:tab w:val="center" w:pos="4680"/>
+        <w:tab w:val="right" w:pos="9360"/>
+      </w:tabs>
+    </w:pPr>
+  </w:style>
+  <w:style w:type="character" w:customStyle="1" w:styleId="FooterChar">
+    <w:name w:val="Footer Char"/>
+    <w:basedOn w:val="DefaultParagraphFont"/>
+    <w:link w:val="Footer"/>
+    <w:uiPriority w:val="99"/>
+    <w:rsid w:val="00FB674B"/>
+  </w:style>
+  <w:style w:type="paragraph" w:styleId="NoSpacing">
+    <w:name w:val="No Spacing"/>
+    <w:link w:val="NoSpacingChar"/>
+    <w:uiPriority w:val="1"/>
     <w:qFormat/>
+    <w:rsid w:val="00461CD4"/>
+    <w:rPr>
+      <w:rFonts w:asciiTheme="minorHAnsi" w:eastAsiaTheme="minorEastAsia" w:hAnsiTheme="minorHAnsi" w:cstheme="minorBidi"/>
+    </w:rPr>
+  </w:style>
+  <w:style w:type="character" w:customStyle="1" w:styleId="NoSpacingChar">
+    <w:name w:val="No Spacing Char"/>
+    <w:basedOn w:val="DefaultParagraphFont"/>
+    <w:link w:val="NoSpacing"/>
+    <w:uiPriority w:val="1"/>
+    <w:rsid w:val="00461CD4"/>
+    <w:rPr>
+      <w:rFonts w:asciiTheme="minorHAnsi" w:eastAsiaTheme="minorEastAsia" w:hAnsiTheme="minorHAnsi" w:cstheme="minorBidi"/>
+    </w:rPr>
+  </w:style>
+  <w:style w:type="paragraph" w:styleId="Caption">
+    <w:name w:val="caption"/>
+    <w:basedOn w:val="Normal"/>
+    <w:next w:val="Normal"/>
+    <w:uiPriority w:val="35"/>
+    <w:unhideWhenUsed/>
+    <w:qFormat/>
+    <w:rsid w:val="00461CD4"/>
     <w:pPr>
-      <w:spacing w:before="240" w:line="259" w:lineRule="auto"/>
-      <w:outlineLvl w:val="9"/>
+      <w:spacing w:after="200"/>
     </w:pPr>
     <w:rPr>
-      <w:rFonts w:asciiTheme="majorHAnsi" w:eastAsiaTheme="majorEastAsia" w:hAnsiTheme="majorHAnsi" w:cstheme="majorBidi"/>
-      <w:b w:val="0"/>
-      <w:bCs w:val="0"/>
-      <w:color w:val="365F91" w:themeColor="accent1" w:themeShade="BF"/>
+      <w:i/>
+      <w:iCs/>
+      <w:color w:val="0E2841" w:themeColor="text2"/>
+      <w:sz w:val="18"/>
+      <w:szCs w:val="18"/>
     </w:rPr>
   </w:style>
   <w:style w:type="paragraph" w:customStyle="1" w:styleId="SourceCode">
@@ -8826,44 +9355,44 @@
         <a:sysClr val="window" lastClr="FFFFFF"/>
       </a:lt1>
       <a:dk2>
-        <a:srgbClr val="1F497D"/>
+        <a:srgbClr val="0E2841"/>
       </a:dk2>
       <a:lt2>
-        <a:srgbClr val="EEECE1"/>
+        <a:srgbClr val="E8E8E8"/>
       </a:lt2>
       <a:accent1>
-        <a:srgbClr val="4F81BD"/>
+        <a:srgbClr val="156082"/>
       </a:accent1>
       <a:accent2>
-        <a:srgbClr val="C0504D"/>
+        <a:srgbClr val="E97132"/>
       </a:accent2>
       <a:accent3>
-        <a:srgbClr val="9BBB59"/>
+        <a:srgbClr val="196B24"/>
       </a:accent3>
       <a:accent4>
-        <a:srgbClr val="8064A2"/>
+        <a:srgbClr val="0F9ED5"/>
       </a:accent4>
       <a:accent5>
-        <a:srgbClr val="4BACC6"/>
+        <a:srgbClr val="A02B93"/>
       </a:accent5>
       <a:accent6>
-        <a:srgbClr val="F79646"/>
+        <a:srgbClr val="4EA72E"/>
       </a:accent6>
       <a:hlink>
-        <a:srgbClr val="0000FF"/>
+        <a:srgbClr val="467886"/>
       </a:hlink>
       <a:folHlink>
-        <a:srgbClr val="800080"/>
+        <a:srgbClr val="96607D"/>
       </a:folHlink>
     </a:clrScheme>
     <a:fontScheme name="Office">
       <a:majorFont>
-        <a:latin typeface="Calibri"/>
+        <a:latin typeface="Aptos Display" panose="02110004020202020204"/>
         <a:ea typeface=""/>
         <a:cs typeface=""/>
-        <a:font script="Jpan" typeface="ＭＳ ゴシック"/>
+        <a:font script="Jpan" typeface="游ゴシック Light"/>
         <a:font script="Hang" typeface="맑은 고딕"/>
-        <a:font script="Hans" typeface="宋体"/>
+        <a:font script="Hans" typeface="等线 Light"/>
         <a:font script="Hant" typeface="新細明體"/>
         <a:font script="Arab" typeface="Times New Roman"/>
         <a:font script="Hebr" typeface="Times New Roman"/>
@@ -8890,14 +9419,32 @@
         <a:font script="Mong" typeface="Mongolian Baiti"/>
         <a:font script="Viet" typeface="Times New Roman"/>
         <a:font script="Uigh" typeface="Microsoft Uighur"/>
+        <a:font script="Geor" typeface="Sylfaen"/>
+        <a:font script="Armn" typeface="Arial"/>
+        <a:font script="Bugi" typeface="Leelawadee UI"/>
+        <a:font script="Bopo" typeface="Microsoft JhengHei"/>
+        <a:font script="Java" typeface="Javanese Text"/>
+        <a:font script="Lisu" typeface="Segoe UI"/>
+        <a:font script="Mymr" typeface="Myanmar Text"/>
+        <a:font script="Nkoo" typeface="Ebrima"/>
+        <a:font script="Olck" typeface="Nirmala UI"/>
+        <a:font script="Osma" typeface="Ebrima"/>
+        <a:font script="Phag" typeface="Phagspa"/>
+        <a:font script="Syrn" typeface="Estrangelo Edessa"/>
+        <a:font script="Syrj" typeface="Estrangelo Edessa"/>
+        <a:font script="Syre" typeface="Estrangelo Edessa"/>
+        <a:font script="Sora" typeface="Nirmala UI"/>
+        <a:font script="Tale" typeface="Microsoft Tai Le"/>
+        <a:font script="Talu" typeface="Microsoft New Tai Lue"/>
+        <a:font script="Tfng" typeface="Ebrima"/>
       </a:majorFont>
       <a:minorFont>
-        <a:latin typeface="Cambria"/>
+        <a:latin typeface="Aptos" panose="02110004020202020204"/>
         <a:ea typeface=""/>
         <a:cs typeface=""/>
-        <a:font script="Jpan" typeface="ＭＳ 明朝"/>
+        <a:font script="Jpan" typeface="游明朝"/>
         <a:font script="Hang" typeface="맑은 고딕"/>
-        <a:font script="Hans" typeface="宋体"/>
+        <a:font script="Hans" typeface="等线"/>
         <a:font script="Hant" typeface="新細明體"/>
         <a:font script="Arab" typeface="Arial"/>
         <a:font script="Hebr" typeface="Arial"/>
@@ -8924,6 +9471,24 @@
         <a:font script="Mong" typeface="Mongolian Baiti"/>
         <a:font script="Viet" typeface="Arial"/>
         <a:font script="Uigh" typeface="Microsoft Uighur"/>
+        <a:font script="Geor" typeface="Sylfaen"/>
+        <a:font script="Armn" typeface="Arial"/>
+        <a:font script="Bugi" typeface="Leelawadee UI"/>
+        <a:font script="Bopo" typeface="Microsoft JhengHei"/>
+        <a:font script="Java" typeface="Javanese Text"/>
+        <a:font script="Lisu" typeface="Segoe UI"/>
+        <a:font script="Mymr" typeface="Myanmar Text"/>
+        <a:font script="Nkoo" typeface="Ebrima"/>
+        <a:font script="Olck" typeface="Nirmala UI"/>
+        <a:font script="Osma" typeface="Ebrima"/>
+        <a:font script="Phag" typeface="Phagspa"/>
+        <a:font script="Syrn" typeface="Estrangelo Edessa"/>
+        <a:font script="Syrj" typeface="Estrangelo Edessa"/>
+        <a:font script="Syre" typeface="Estrangelo Edessa"/>
+        <a:font script="Sora" typeface="Nirmala UI"/>
+        <a:font script="Tale" typeface="Microsoft Tai Le"/>
+        <a:font script="Talu" typeface="Microsoft New Tai Lue"/>
+        <a:font script="Tfng" typeface="Ebrima"/>
       </a:minorFont>
     </a:fontScheme>
     <a:fmtScheme name="Office">
@@ -8935,180 +9500,136 @@
           <a:gsLst>
             <a:gs pos="0">
               <a:schemeClr val="phClr">
-                <a:tint val="50000"/>
-                <a:satMod val="300000"/>
+                <a:lumMod val="110000"/>
+                <a:satMod val="105000"/>
+                <a:tint val="67000"/>
               </a:schemeClr>
             </a:gs>
-            <a:gs pos="35000">
+            <a:gs pos="50000">
               <a:schemeClr val="phClr">
-                <a:tint val="37000"/>
-                <a:satMod val="300000"/>
+                <a:lumMod val="105000"/>
+                <a:satMod val="103000"/>
+                <a:tint val="73000"/>
               </a:schemeClr>
             </a:gs>
             <a:gs pos="100000">
               <a:schemeClr val="phClr">
-                <a:tint val="15000"/>
-                <a:satMod val="350000"/>
+                <a:lumMod val="105000"/>
+                <a:satMod val="109000"/>
+                <a:tint val="81000"/>
               </a:schemeClr>
             </a:gs>
           </a:gsLst>
-          <a:lin ang="16200000" scaled="1"/>
+          <a:lin ang="5400000" scaled="0"/>
         </a:gradFill>
         <a:gradFill rotWithShape="1">
           <a:gsLst>
             <a:gs pos="0">
               <a:schemeClr val="phClr">
-                <a:tint val="100000"/>
+                <a:satMod val="103000"/>
+                <a:lumMod val="102000"/>
+                <a:tint val="94000"/>
+              </a:schemeClr>
+            </a:gs>
+            <a:gs pos="50000">
+              <a:schemeClr val="phClr">
+                <a:satMod val="110000"/>
+                <a:lumMod val="100000"/>
                 <a:shade val="100000"/>
-                <a:satMod val="130000"/>
               </a:schemeClr>
             </a:gs>
             <a:gs pos="100000">
               <a:schemeClr val="phClr">
-                <a:tint val="50000"/>
-                <a:shade val="100000"/>
-                <a:satMod val="350000"/>
+                <a:lumMod val="99000"/>
+                <a:satMod val="120000"/>
+                <a:shade val="78000"/>
               </a:schemeClr>
             </a:gs>
           </a:gsLst>
-          <a:lin ang="16200000" scaled="0"/>
+          <a:lin ang="5400000" scaled="0"/>
         </a:gradFill>
       </a:fillStyleLst>
       <a:lnStyleLst>
-        <a:ln w="9525" cap="flat" cmpd="sng" algn="ctr">
+        <a:ln w="12700" cap="flat" cmpd="sng" algn="ctr">
           <a:solidFill>
-            <a:schemeClr val="phClr">
-              <a:shade val="95000"/>
-              <a:satMod val="105000"/>
-            </a:schemeClr>
+            <a:schemeClr val="phClr"/>
           </a:solidFill>
           <a:prstDash val="solid"/>
+          <a:miter lim="800000"/>
+        </a:ln>
+        <a:ln w="19050" cap="flat" cmpd="sng" algn="ctr">
+          <a:solidFill>
+            <a:schemeClr val="phClr"/>
+          </a:solidFill>
+          <a:prstDash val="solid"/>
+          <a:miter lim="800000"/>
         </a:ln>
         <a:ln w="25400" cap="flat" cmpd="sng" algn="ctr">
           <a:solidFill>
             <a:schemeClr val="phClr"/>
           </a:solidFill>
           <a:prstDash val="solid"/>
-        </a:ln>
-        <a:ln w="38100" cap="flat" cmpd="sng" algn="ctr">
-          <a:solidFill>
-            <a:schemeClr val="phClr"/>
-          </a:solidFill>
-          <a:prstDash val="solid"/>
+          <a:miter lim="800000"/>
         </a:ln>
       </a:lnStyleLst>
       <a:effectStyleLst>
         <a:effectStyle>
+          <a:effectLst/>
+        </a:effectStyle>
+        <a:effectStyle>
+          <a:effectLst/>
+        </a:effectStyle>
+        <a:effectStyle>
           <a:effectLst>
-            <a:outerShdw blurRad="40000" dist="20000" dir="5400000" rotWithShape="0">
+            <a:outerShdw blurRad="57150" dist="19050" dir="5400000" algn="ctr" rotWithShape="0">
               <a:srgbClr val="000000">
-                <a:alpha val="38000"/>
+                <a:alpha val="63000"/>
               </a:srgbClr>
             </a:outerShdw>
           </a:effectLst>
-        </a:effectStyle>
-        <a:effectStyle>
-          <a:effectLst>
-            <a:outerShdw blurRad="40000" dist="23000" dir="5400000" rotWithShape="0">
-              <a:srgbClr val="000000">
-                <a:alpha val="35000"/>
-              </a:srgbClr>
-            </a:outerShdw>
-          </a:effectLst>
-        </a:effectStyle>
-        <a:effectStyle>
-          <a:effectLst>
-            <a:outerShdw blurRad="40000" dist="23000" dir="5400000" rotWithShape="0">
-              <a:srgbClr val="000000">
-                <a:alpha val="35000"/>
-              </a:srgbClr>
-            </a:outerShdw>
-          </a:effectLst>
-          <a:scene3d>
-            <a:camera prst="orthographicFront">
-              <a:rot lat="0" lon="0" rev="0"/>
-            </a:camera>
-            <a:lightRig rig="threePt" dir="t">
-              <a:rot lat="0" lon="0" rev="1200000"/>
-            </a:lightRig>
-          </a:scene3d>
-          <a:sp3d>
-            <a:bevelT w="63500" h="25400"/>
-          </a:sp3d>
         </a:effectStyle>
       </a:effectStyleLst>
       <a:bgFillStyleLst>
         <a:solidFill>
           <a:schemeClr val="phClr"/>
         </a:solidFill>
+        <a:solidFill>
+          <a:schemeClr val="phClr">
+            <a:tint val="95000"/>
+            <a:satMod val="170000"/>
+          </a:schemeClr>
+        </a:solidFill>
         <a:gradFill rotWithShape="1">
           <a:gsLst>
             <a:gs pos="0">
               <a:schemeClr val="phClr">
-                <a:tint val="40000"/>
-                <a:satMod val="350000"/>
+                <a:tint val="93000"/>
+                <a:satMod val="150000"/>
+                <a:shade val="98000"/>
+                <a:lumMod val="102000"/>
               </a:schemeClr>
             </a:gs>
-            <a:gs pos="40000">
+            <a:gs pos="50000">
               <a:schemeClr val="phClr">
-                <a:tint val="45000"/>
-                <a:shade val="99000"/>
-                <a:satMod val="350000"/>
+                <a:tint val="98000"/>
+                <a:satMod val="130000"/>
+                <a:shade val="90000"/>
+                <a:lumMod val="103000"/>
               </a:schemeClr>
             </a:gs>
             <a:gs pos="100000">
               <a:schemeClr val="phClr">
-                <a:shade val="20000"/>
-                <a:satMod val="255000"/>
+                <a:shade val="63000"/>
+                <a:satMod val="120000"/>
               </a:schemeClr>
             </a:gs>
           </a:gsLst>
-          <a:path path="circle">
-            <a:fillToRect l="50000" t="-80000" r="50000" b="180000"/>
-          </a:path>
-        </a:gradFill>
-        <a:gradFill rotWithShape="1">
-          <a:gsLst>
-            <a:gs pos="0">
-              <a:schemeClr val="phClr">
-                <a:tint val="80000"/>
-                <a:satMod val="300000"/>
-              </a:schemeClr>
-            </a:gs>
-            <a:gs pos="100000">
-              <a:schemeClr val="phClr">
-                <a:shade val="30000"/>
-                <a:satMod val="200000"/>
-              </a:schemeClr>
-            </a:gs>
-          </a:gsLst>
-          <a:path path="circle">
-            <a:fillToRect l="50000" t="50000" r="50000" b="50000"/>
-          </a:path>
+          <a:lin ang="5400000" scaled="0"/>
         </a:gradFill>
       </a:bgFillStyleLst>
     </a:fmtScheme>
   </a:themeElements>
   <a:objectDefaults>
-    <a:spDef>
-      <a:spPr/>
-      <a:bodyPr/>
-      <a:lstStyle/>
-      <a:style>
-        <a:lnRef idx="1">
-          <a:schemeClr val="accent1"/>
-        </a:lnRef>
-        <a:fillRef idx="3">
-          <a:schemeClr val="accent1"/>
-        </a:fillRef>
-        <a:effectRef idx="2">
-          <a:schemeClr val="accent1"/>
-        </a:effectRef>
-        <a:fontRef idx="minor">
-          <a:schemeClr val="lt1"/>
-        </a:fontRef>
-      </a:style>
-    </a:spDef>
     <a:lnDef>
       <a:spPr/>
       <a:bodyPr/>
@@ -9130,5 +9651,10 @@
     </a:lnDef>
   </a:objectDefaults>
   <a:extraClrSchemeLst/>
+  <a:extLst>
+    <a:ext uri="{05A4C25C-085E-4340-85A3-A5531E510DB2}">
+      <thm15:themeFamily xmlns:thm15="http://schemas.microsoft.com/office/thememl/2012/main" name="Office Theme" id="{2E142A2C-CD16-42D6-873A-C26D2A0506FA}" vid="{1BDDFF52-6CD6-40A5-AB3C-68EB2F1E4D0A}"/>
+    </a:ext>
+  </a:extLst>
 </a:theme>
 </file>
</xml_diff>